<commit_message>
change tz.docx; add 1st chapter to the systproj.docx
</commit_message>
<xml_diff>
--- a/docs/SystProj.docx
+++ b/docs/SystProj.docx
@@ -63,7 +63,6 @@
         <w:rPr>
           <w:rFonts w:eastAsia="Calibri"/>
           <w:szCs w:val="28"/>
-          <w:lang w:val="en-US"/>
         </w:rPr>
       </w:pPr>
       <w:r>
@@ -82,7 +81,6 @@
         <w:rPr>
           <w:rFonts w:eastAsia="Calibri"/>
           <w:szCs w:val="28"/>
-          <w:lang w:val="en-US"/>
         </w:rPr>
       </w:pPr>
     </w:p>
@@ -308,7 +306,6 @@
         <w:rPr>
           <w:rFonts w:eastAsia="Calibri"/>
           <w:szCs w:val="28"/>
-          <w:lang w:val="en-US"/>
         </w:rPr>
       </w:pPr>
       <w:r>
@@ -327,7 +324,6 @@
         <w:rPr>
           <w:rFonts w:eastAsia="Calibri"/>
           <w:szCs w:val="28"/>
-          <w:lang w:val="en-US"/>
         </w:rPr>
       </w:pPr>
       <w:r>
@@ -524,7 +520,6 @@
         <w:rPr>
           <w:rFonts w:eastAsia="Calibri"/>
           <w:szCs w:val="28"/>
-          <w:lang w:val="en-US"/>
         </w:rPr>
         <w:t>6</w:t>
       </w:r>
@@ -693,7 +688,6 @@
         <w:rPr>
           <w:rFonts w:eastAsia="Calibri"/>
           <w:szCs w:val="28"/>
-          <w:lang w:val="en-US"/>
         </w:rPr>
         <w:t>6</w:t>
       </w:r>
@@ -726,15 +720,7 @@
       </w:r>
     </w:p>
     <w:p>
-      <w:pPr>
-        <w:rPr>
-          <w:lang w:val="en-US"/>
-        </w:rPr>
-      </w:pPr>
-      <w:r>
-        <w:rPr>
-          <w:lang w:val="en-US"/>
-        </w:rPr>
+      <w:r>
         <w:br w:type="page"/>
       </w:r>
     </w:p>
@@ -772,50 +758,2625 @@
     </w:p>
     <w:p/>
     <w:p>
+      <w:r>
+        <w:t>Система автоматизированного проектирования (САПР) — это программный комплекс, предназначенный для создания, редактирования и оформления конструкторской и проектной документации, а также для построения и анализа геометрических моделей изделий. САПР позволяет снизить трудозатраты на проектирование, уменьшить количество ошибок, повысить повторяемость результатов и обеспечить стандартизированное хранение и обмен проектными данными.</w:t>
+      </w:r>
+    </w:p>
+    <w:p>
+      <w:r>
+        <w:t>В качестве САПР для разработки плагина выбрана</w:t>
+      </w:r>
+      <w:r>
+        <w:t xml:space="preserve"> </w:t>
+      </w:r>
+      <w:r>
+        <w:t>nanoCAD 26</w:t>
+      </w:r>
+      <w:r>
+        <w:t xml:space="preserve"> –</w:t>
+      </w:r>
+      <w:r>
+        <w:t xml:space="preserve"> DWG</w:t>
+      </w:r>
+      <w:r>
+        <w:noBreakHyphen/>
+        <w:t>ориентированная САПР-платформа, предназначенная для выполнения 2D</w:t>
+      </w:r>
+      <w:r>
+        <w:noBreakHyphen/>
+        <w:t>черчения и проектирования, а также решения прикладных задач за счёт расширения функциональности с помощью модулей и программных расширений. nanoCAD предоставляет пользователю инструменты создания и редактирования чертежей, работы со слоями и аннотациями, а также поддерживает создание и редактирование геометрических объектов, необходимых для построения модели детали. Для задач настоящего проекта важно, что nanoCAD позволяет программно создавать геометрию в документе и выполнять операции построения через интерфейсы разработчика (API).</w:t>
+      </w:r>
+    </w:p>
+    <w:p>
+      <w:r>
+        <w:t>Аналоги nanoCAD (прямые):</w:t>
+      </w:r>
+    </w:p>
+    <w:p>
+      <w:pPr>
+        <w:numPr>
+          <w:ilvl w:val="0"/>
+          <w:numId w:val="2"/>
+        </w:numPr>
+        <w:ind w:left="0" w:firstLine="709"/>
+      </w:pPr>
+      <w:r>
+        <w:t>AutoCAD</w:t>
+      </w:r>
+      <w:r>
+        <w:t xml:space="preserve"> –</w:t>
+      </w:r>
+      <w:r>
+        <w:t xml:space="preserve"> наиболее распространённая DWG</w:t>
+      </w:r>
+      <w:r>
+        <w:noBreakHyphen/>
+        <w:t>САПР, имеющая схожую модель работы (документ/чертёж, команды, слои, объектная база чертежа) и развитые средства расширения.</w:t>
+      </w:r>
+    </w:p>
+    <w:p>
+      <w:pPr>
+        <w:numPr>
+          <w:ilvl w:val="0"/>
+          <w:numId w:val="2"/>
+        </w:numPr>
+        <w:ind w:left="0" w:firstLine="709"/>
+      </w:pPr>
+      <w:r>
+        <w:t>BricsCAD</w:t>
+      </w:r>
+      <w:r>
+        <w:t xml:space="preserve"> </w:t>
+      </w:r>
+      <w:r>
+        <w:t>–</w:t>
+      </w:r>
+      <w:r>
+        <w:t xml:space="preserve"> DWG</w:t>
+      </w:r>
+      <w:r>
+        <w:noBreakHyphen/>
+        <w:t>совместимая САПР, близкая по интерфейсу и идеологии к AutoCAD, также поддерживает расширение через API.</w:t>
+      </w:r>
+    </w:p>
+    <w:p>
+      <w:pPr>
+        <w:ind w:left="709" w:firstLine="0"/>
+      </w:pPr>
+      <w:r>
+        <w:t>Косвенные аналоги:</w:t>
+      </w:r>
+    </w:p>
+    <w:p>
+      <w:pPr>
+        <w:numPr>
+          <w:ilvl w:val="0"/>
+          <w:numId w:val="3"/>
+        </w:numPr>
+        <w:ind w:left="0" w:firstLine="709"/>
+      </w:pPr>
+      <w:r>
+        <w:t>FreeCAD</w:t>
+      </w:r>
+      <w:r>
+        <w:t xml:space="preserve"> </w:t>
+      </w:r>
+      <w:r>
+        <w:t>–</w:t>
+      </w:r>
+      <w:r>
+        <w:t xml:space="preserve"> параметрическая САПР, ориентированная на построение 3D</w:t>
+      </w:r>
+      <w:r>
+        <w:noBreakHyphen/>
+        <w:t xml:space="preserve">моделей; отличается идеологией (параметрическое </w:t>
+      </w:r>
+      <w:r>
+        <w:lastRenderedPageBreak/>
+        <w:t>моделирование), но решает похожую задачу автоматизации построения деталей.</w:t>
+      </w:r>
+    </w:p>
+    <w:p>
+      <w:pPr>
+        <w:ind w:left="709" w:firstLine="0"/>
+      </w:pPr>
+      <w:r>
+        <w:t>Причины выбора nanoCAD 26:</w:t>
+      </w:r>
+    </w:p>
+    <w:p>
+      <w:pPr>
+        <w:numPr>
+          <w:ilvl w:val="0"/>
+          <w:numId w:val="4"/>
+        </w:numPr>
+        <w:ind w:left="0" w:firstLine="709"/>
+      </w:pPr>
+      <w:r>
+        <w:t>Доступность: имеется возможность использования учебной лицензии.</w:t>
+      </w:r>
+    </w:p>
+    <w:p>
+      <w:pPr>
+        <w:numPr>
+          <w:ilvl w:val="0"/>
+          <w:numId w:val="4"/>
+        </w:numPr>
+        <w:ind w:left="0" w:firstLine="709"/>
+      </w:pPr>
+      <w:r>
+        <w:t>Поддержка расширения через API: nanoCAD предоставляет SDK и средства разработки плагинов, что соответствует цели лабораторных работ (создание программного расширения САПР).</w:t>
+      </w:r>
+    </w:p>
+    <w:p>
+      <w:pPr>
+        <w:numPr>
+          <w:ilvl w:val="0"/>
+          <w:numId w:val="4"/>
+        </w:numPr>
+        <w:ind w:left="0" w:firstLine="709"/>
+      </w:pPr>
+      <w:r>
+        <w:t>Поддержка C# и платформы .NET: разработка плагина на C# упрощает реализацию пользовательского интерфейса и бизнес</w:t>
+      </w:r>
+      <w:r>
+        <w:noBreakHyphen/>
+        <w:t>логики, ускоряет разработку и снижает порог входа.</w:t>
+      </w:r>
+    </w:p>
+    <w:p/>
+    <w:p>
       <w:pPr>
         <w:pStyle w:val="Heading2"/>
+      </w:pPr>
+      <w:r>
+        <w:t xml:space="preserve">1.2 Описание </w:t>
+      </w:r>
+      <w:r>
         <w:rPr>
           <w:lang w:val="en-US"/>
         </w:rPr>
-      </w:pPr>
-      <w:r>
-        <w:t xml:space="preserve">1.2 Описание </w:t>
-      </w:r>
-      <w:r>
+        <w:t>API</w:t>
+      </w:r>
+    </w:p>
+    <w:p/>
+    <w:p>
+      <w:r>
+        <w:t>API (Application Programming Interface) — набор классов, методов и правил, позволяющий внешнему коду взаимодействовать с nanoCAD: получать доступ к активному документу, создавать/изменять объекты чертежа и выполнять команды.</w:t>
+      </w:r>
+    </w:p>
+    <w:p>
+      <w:r>
+        <w:t>.NET API состоит из двух основных веток пространств имён:</w:t>
+      </w:r>
+    </w:p>
+    <w:p>
+      <w:pPr>
+        <w:numPr>
+          <w:ilvl w:val="0"/>
+          <w:numId w:val="5"/>
+        </w:numPr>
+        <w:ind w:left="0" w:firstLine="709"/>
+      </w:pPr>
+      <w:r>
+        <w:t>HostMgd.*</w:t>
+      </w:r>
+      <w:r>
+        <w:t xml:space="preserve"> </w:t>
+      </w:r>
+      <w:r>
+        <w:t>— доступ к приложению, документам и взаимодействию с пользователем (Editor, ввод/вывод, контекст команды).</w:t>
+      </w:r>
+    </w:p>
+    <w:p>
+      <w:pPr>
+        <w:numPr>
+          <w:ilvl w:val="0"/>
+          <w:numId w:val="5"/>
+        </w:numPr>
+        <w:ind w:left="0" w:firstLine="709"/>
+      </w:pPr>
+      <w:r>
+        <w:t>Teigha.*</w:t>
+      </w:r>
+      <w:r>
+        <w:t xml:space="preserve"> </w:t>
+      </w:r>
+      <w:r>
+        <w:t>— работа с базой данных чертежа, геометрией и сущностями (DatabaseServices, Geometry, Runtime).</w:t>
+      </w:r>
+    </w:p>
+    <w:p>
+      <w:r>
+        <w:t>Краткое руководство: подключение и запуск</w:t>
+      </w:r>
+      <w:r>
+        <w:t>:</w:t>
+      </w:r>
+    </w:p>
+    <w:p>
+      <w:pPr>
+        <w:numPr>
+          <w:ilvl w:val="0"/>
+          <w:numId w:val="6"/>
+        </w:numPr>
+        <w:ind w:left="0" w:firstLine="709"/>
         <w:rPr>
           <w:lang w:val="en-US"/>
         </w:rPr>
-        <w:t>API</w:t>
-      </w:r>
-    </w:p>
-    <w:p>
-      <w:pPr>
+      </w:pPr>
+      <w:r>
+        <w:t>с</w:t>
+      </w:r>
+      <w:r>
+        <w:t>оздать</w:t>
+      </w:r>
+      <w:r>
         <w:rPr>
           <w:lang w:val="en-US"/>
         </w:rPr>
-      </w:pPr>
-    </w:p>
+        <w:t xml:space="preserve"> </w:t>
+      </w:r>
+      <w:r>
+        <w:t>проект</w:t>
+      </w:r>
+      <w:r>
+        <w:rPr>
+          <w:lang w:val="en-US"/>
+        </w:rPr>
+        <w:t xml:space="preserve"> </w:t>
+      </w:r>
+      <w:r>
+        <w:rPr>
+          <w:lang w:val="en-US"/>
+        </w:rPr>
+        <w:t>Class Library</w:t>
+      </w:r>
+      <w:r>
+        <w:rPr>
+          <w:lang w:val="en-US"/>
+        </w:rPr>
+        <w:t xml:space="preserve"> </w:t>
+      </w:r>
+      <w:r>
+        <w:rPr>
+          <w:lang w:val="en-US"/>
+        </w:rPr>
+        <w:t>(C#),</w:t>
+      </w:r>
+      <w:r>
+        <w:rPr>
+          <w:lang w:val="en-US"/>
+        </w:rPr>
+        <w:t xml:space="preserve"> </w:t>
+      </w:r>
+      <w:proofErr w:type="spellStart"/>
+      <w:r>
+        <w:rPr>
+          <w:lang w:val="en-US"/>
+        </w:rPr>
+        <w:t>TargetFramework</w:t>
+      </w:r>
+      <w:proofErr w:type="spellEnd"/>
+      <w:r>
+        <w:rPr>
+          <w:lang w:val="en-US"/>
+        </w:rPr>
+        <w:t xml:space="preserve"> = net6.0-windows,</w:t>
+      </w:r>
+      <w:r>
+        <w:rPr>
+          <w:lang w:val="en-US"/>
+        </w:rPr>
+        <w:t xml:space="preserve"> </w:t>
+      </w:r>
+      <w:r>
+        <w:rPr>
+          <w:lang w:val="en-US"/>
+        </w:rPr>
+        <w:t>Platform target = x64.</w:t>
+      </w:r>
+    </w:p>
+    <w:p>
+      <w:pPr>
+        <w:numPr>
+          <w:ilvl w:val="0"/>
+          <w:numId w:val="6"/>
+        </w:numPr>
+        <w:ind w:left="0" w:firstLine="709"/>
+      </w:pPr>
+      <w:r>
+        <w:t>д</w:t>
+      </w:r>
+      <w:r>
+        <w:t>обавить ссылки на DLL из SDK (lib-x64) или из папки установки nanoCAD (как в samples).</w:t>
+      </w:r>
+    </w:p>
+    <w:p>
+      <w:pPr>
+        <w:numPr>
+          <w:ilvl w:val="0"/>
+          <w:numId w:val="6"/>
+        </w:numPr>
+        <w:ind w:left="0" w:firstLine="709"/>
+      </w:pPr>
+      <w:r>
+        <w:t>д</w:t>
+      </w:r>
+      <w:r>
+        <w:t>ля добавленных CAD</w:t>
+      </w:r>
+      <w:r>
+        <w:noBreakHyphen/>
+        <w:t>DLL установить</w:t>
+      </w:r>
+      <w:r>
+        <w:t xml:space="preserve"> </w:t>
+      </w:r>
+      <w:r>
+        <w:t>Copy Local = False.</w:t>
+      </w:r>
+    </w:p>
+    <w:p>
+      <w:pPr>
+        <w:numPr>
+          <w:ilvl w:val="0"/>
+          <w:numId w:val="6"/>
+        </w:numPr>
+        <w:ind w:left="0" w:firstLine="709"/>
+      </w:pPr>
+      <w:r>
+        <w:t>р</w:t>
+      </w:r>
+      <w:r>
+        <w:t>еализовать команду через атрибут</w:t>
+      </w:r>
+      <w:r>
+        <w:t xml:space="preserve"> </w:t>
+      </w:r>
+      <w:r>
+        <w:t>[CommandMethod("...")].</w:t>
+      </w:r>
+    </w:p>
+    <w:p>
+      <w:pPr>
+        <w:numPr>
+          <w:ilvl w:val="0"/>
+          <w:numId w:val="6"/>
+        </w:numPr>
+        <w:ind w:left="0" w:firstLine="709"/>
+      </w:pPr>
+      <w:r>
+        <w:lastRenderedPageBreak/>
+        <w:t>с</w:t>
+      </w:r>
+      <w:r>
+        <w:t>обрать DLL.</w:t>
+      </w:r>
+    </w:p>
+    <w:p>
+      <w:pPr>
+        <w:numPr>
+          <w:ilvl w:val="0"/>
+          <w:numId w:val="6"/>
+        </w:numPr>
+        <w:ind w:left="0" w:firstLine="709"/>
+      </w:pPr>
+      <w:r>
+        <w:t>в</w:t>
+      </w:r>
+      <w:r>
+        <w:t xml:space="preserve"> nanoCAD выполнить</w:t>
+      </w:r>
+      <w:r>
+        <w:t xml:space="preserve"> </w:t>
+      </w:r>
+      <w:r>
+        <w:t>NETLOAD/APPLOAD</w:t>
+      </w:r>
+      <w:r>
+        <w:t xml:space="preserve">, </w:t>
+      </w:r>
+      <w:r>
+        <w:t>выбрать DLL</w:t>
+      </w:r>
+      <w:r>
+        <w:t xml:space="preserve">, </w:t>
+      </w:r>
+      <w:r>
+        <w:t>выполнить команду (например</w:t>
+      </w:r>
+      <w:r>
+        <w:t xml:space="preserve"> </w:t>
+      </w:r>
+      <w:r>
+        <w:t>ECCWASHER).</w:t>
+      </w:r>
+    </w:p>
+    <w:p/>
+    <w:p>
+      <w:pPr>
+        <w:spacing w:line="240" w:lineRule="auto"/>
+        <w:ind w:firstLine="0"/>
+      </w:pPr>
+      <w:r>
+        <w:t xml:space="preserve">Таблица </w:t>
+      </w:r>
+      <w:r>
+        <w:t>1</w:t>
+      </w:r>
+      <w:r>
+        <w:t>.1 – Используемые свойства/объекты API (для доступа к документу и БД)</w:t>
+      </w:r>
+    </w:p>
+    <w:tbl>
+      <w:tblPr>
+        <w:tblW w:w="9467" w:type="dxa"/>
+        <w:tblBorders>
+          <w:top w:val="single" w:sz="4" w:space="0" w:color="auto"/>
+          <w:left w:val="single" w:sz="4" w:space="0" w:color="auto"/>
+          <w:bottom w:val="single" w:sz="4" w:space="0" w:color="auto"/>
+          <w:right w:val="single" w:sz="4" w:space="0" w:color="auto"/>
+          <w:insideH w:val="single" w:sz="4" w:space="0" w:color="auto"/>
+          <w:insideV w:val="single" w:sz="4" w:space="0" w:color="auto"/>
+        </w:tblBorders>
+        <w:tblCellMar>
+          <w:top w:w="15" w:type="dxa"/>
+          <w:left w:w="15" w:type="dxa"/>
+          <w:bottom w:w="15" w:type="dxa"/>
+          <w:right w:w="15" w:type="dxa"/>
+        </w:tblCellMar>
+        <w:tblLook w:val="04A0" w:firstRow="1" w:lastRow="0" w:firstColumn="1" w:lastColumn="0" w:noHBand="0" w:noVBand="1"/>
+      </w:tblPr>
+      <w:tblGrid>
+        <w:gridCol w:w="3653"/>
+        <w:gridCol w:w="1871"/>
+        <w:gridCol w:w="3943"/>
+      </w:tblGrid>
+      <w:tr>
+        <w:trPr>
+          <w:tblHeader/>
+        </w:trPr>
+        <w:tc>
+          <w:tcPr>
+            <w:tcW w:w="3653" w:type="dxa"/>
+            <w:noWrap/>
+            <w:vAlign w:val="center"/>
+            <w:hideMark/>
+          </w:tcPr>
+          <w:p>
+            <w:pPr>
+              <w:spacing w:line="240" w:lineRule="auto"/>
+              <w:ind w:firstLine="0"/>
+              <w:jc w:val="center"/>
+              <w:rPr>
+                <w:sz w:val="22"/>
+              </w:rPr>
+            </w:pPr>
+            <w:r>
+              <w:rPr>
+                <w:sz w:val="22"/>
+              </w:rPr>
+              <w:t>Название</w:t>
+            </w:r>
+          </w:p>
+        </w:tc>
+        <w:tc>
+          <w:tcPr>
+            <w:tcW w:w="1871" w:type="dxa"/>
+            <w:noWrap/>
+            <w:vAlign w:val="center"/>
+            <w:hideMark/>
+          </w:tcPr>
+          <w:p>
+            <w:pPr>
+              <w:spacing w:line="240" w:lineRule="auto"/>
+              <w:ind w:firstLine="0"/>
+              <w:jc w:val="center"/>
+              <w:rPr>
+                <w:sz w:val="22"/>
+              </w:rPr>
+            </w:pPr>
+            <w:r>
+              <w:rPr>
+                <w:sz w:val="22"/>
+              </w:rPr>
+              <w:t>Тип данных</w:t>
+            </w:r>
+          </w:p>
+        </w:tc>
+        <w:tc>
+          <w:tcPr>
+            <w:tcW w:w="3943" w:type="dxa"/>
+            <w:noWrap/>
+            <w:vAlign w:val="center"/>
+            <w:hideMark/>
+          </w:tcPr>
+          <w:p>
+            <w:pPr>
+              <w:spacing w:line="240" w:lineRule="auto"/>
+              <w:ind w:firstLine="0"/>
+              <w:jc w:val="center"/>
+              <w:rPr>
+                <w:sz w:val="22"/>
+              </w:rPr>
+            </w:pPr>
+            <w:r>
+              <w:rPr>
+                <w:sz w:val="22"/>
+              </w:rPr>
+              <w:t>Описание</w:t>
+            </w:r>
+          </w:p>
+        </w:tc>
+      </w:tr>
+      <w:tr>
+        <w:tc>
+          <w:tcPr>
+            <w:tcW w:w="3653" w:type="dxa"/>
+            <w:vAlign w:val="bottom"/>
+            <w:hideMark/>
+          </w:tcPr>
+          <w:p>
+            <w:pPr>
+              <w:spacing w:line="240" w:lineRule="auto"/>
+              <w:ind w:firstLine="0"/>
+              <w:rPr>
+                <w:sz w:val="22"/>
+              </w:rPr>
+            </w:pPr>
+            <w:r>
+              <w:rPr>
+                <w:sz w:val="22"/>
+              </w:rPr>
+              <w:t>Application.DocumentManager</w:t>
+            </w:r>
+          </w:p>
+        </w:tc>
+        <w:tc>
+          <w:tcPr>
+            <w:tcW w:w="1871" w:type="dxa"/>
+            <w:vAlign w:val="bottom"/>
+            <w:hideMark/>
+          </w:tcPr>
+          <w:p>
+            <w:pPr>
+              <w:spacing w:line="240" w:lineRule="auto"/>
+              <w:ind w:firstLine="0"/>
+              <w:rPr>
+                <w:sz w:val="22"/>
+              </w:rPr>
+            </w:pPr>
+            <w:r>
+              <w:rPr>
+                <w:sz w:val="22"/>
+              </w:rPr>
+              <w:t>DocumentManager</w:t>
+            </w:r>
+          </w:p>
+        </w:tc>
+        <w:tc>
+          <w:tcPr>
+            <w:tcW w:w="3943" w:type="dxa"/>
+            <w:vAlign w:val="bottom"/>
+            <w:hideMark/>
+          </w:tcPr>
+          <w:p>
+            <w:pPr>
+              <w:spacing w:line="240" w:lineRule="auto"/>
+              <w:ind w:firstLine="0"/>
+              <w:rPr>
+                <w:sz w:val="22"/>
+              </w:rPr>
+            </w:pPr>
+            <w:r>
+              <w:rPr>
+                <w:sz w:val="22"/>
+              </w:rPr>
+              <w:t>Доступ к менеджеру открытых документов nanoCAD</w:t>
+            </w:r>
+          </w:p>
+        </w:tc>
+      </w:tr>
+      <w:tr>
+        <w:tc>
+          <w:tcPr>
+            <w:tcW w:w="3653" w:type="dxa"/>
+            <w:vAlign w:val="bottom"/>
+            <w:hideMark/>
+          </w:tcPr>
+          <w:p>
+            <w:pPr>
+              <w:spacing w:line="240" w:lineRule="auto"/>
+              <w:ind w:firstLine="0"/>
+              <w:rPr>
+                <w:sz w:val="22"/>
+              </w:rPr>
+            </w:pPr>
+            <w:r>
+              <w:rPr>
+                <w:sz w:val="22"/>
+              </w:rPr>
+              <w:t>DocumentManager.MdiActiveDocument</w:t>
+            </w:r>
+          </w:p>
+        </w:tc>
+        <w:tc>
+          <w:tcPr>
+            <w:tcW w:w="1871" w:type="dxa"/>
+            <w:vAlign w:val="bottom"/>
+            <w:hideMark/>
+          </w:tcPr>
+          <w:p>
+            <w:pPr>
+              <w:spacing w:line="240" w:lineRule="auto"/>
+              <w:ind w:firstLine="0"/>
+              <w:rPr>
+                <w:sz w:val="22"/>
+              </w:rPr>
+            </w:pPr>
+            <w:r>
+              <w:rPr>
+                <w:sz w:val="22"/>
+              </w:rPr>
+              <w:t>Document</w:t>
+            </w:r>
+          </w:p>
+        </w:tc>
+        <w:tc>
+          <w:tcPr>
+            <w:tcW w:w="3943" w:type="dxa"/>
+            <w:vAlign w:val="bottom"/>
+            <w:hideMark/>
+          </w:tcPr>
+          <w:p>
+            <w:pPr>
+              <w:spacing w:line="240" w:lineRule="auto"/>
+              <w:ind w:firstLine="0"/>
+              <w:rPr>
+                <w:sz w:val="22"/>
+              </w:rPr>
+            </w:pPr>
+            <w:r>
+              <w:rPr>
+                <w:sz w:val="22"/>
+              </w:rPr>
+              <w:t>Активный (текущий) документ nanoCAD</w:t>
+            </w:r>
+          </w:p>
+        </w:tc>
+      </w:tr>
+      <w:tr>
+        <w:tc>
+          <w:tcPr>
+            <w:tcW w:w="3653" w:type="dxa"/>
+            <w:vAlign w:val="bottom"/>
+            <w:hideMark/>
+          </w:tcPr>
+          <w:p>
+            <w:pPr>
+              <w:spacing w:line="240" w:lineRule="auto"/>
+              <w:ind w:firstLine="0"/>
+              <w:rPr>
+                <w:sz w:val="22"/>
+              </w:rPr>
+            </w:pPr>
+            <w:r>
+              <w:rPr>
+                <w:sz w:val="22"/>
+              </w:rPr>
+              <w:t>Document.Database</w:t>
+            </w:r>
+          </w:p>
+        </w:tc>
+        <w:tc>
+          <w:tcPr>
+            <w:tcW w:w="1871" w:type="dxa"/>
+            <w:vAlign w:val="bottom"/>
+            <w:hideMark/>
+          </w:tcPr>
+          <w:p>
+            <w:pPr>
+              <w:spacing w:line="240" w:lineRule="auto"/>
+              <w:ind w:firstLine="0"/>
+              <w:rPr>
+                <w:sz w:val="22"/>
+              </w:rPr>
+            </w:pPr>
+            <w:r>
+              <w:rPr>
+                <w:sz w:val="22"/>
+              </w:rPr>
+              <w:t>Database</w:t>
+            </w:r>
+          </w:p>
+        </w:tc>
+        <w:tc>
+          <w:tcPr>
+            <w:tcW w:w="3943" w:type="dxa"/>
+            <w:vAlign w:val="bottom"/>
+            <w:hideMark/>
+          </w:tcPr>
+          <w:p>
+            <w:pPr>
+              <w:spacing w:line="240" w:lineRule="auto"/>
+              <w:ind w:firstLine="0"/>
+              <w:rPr>
+                <w:sz w:val="22"/>
+              </w:rPr>
+            </w:pPr>
+            <w:r>
+              <w:rPr>
+                <w:sz w:val="22"/>
+              </w:rPr>
+              <w:t>База данных текущего документа (чертежа), в которую добавляются сущности</w:t>
+            </w:r>
+          </w:p>
+        </w:tc>
+      </w:tr>
+      <w:tr>
+        <w:tc>
+          <w:tcPr>
+            <w:tcW w:w="3653" w:type="dxa"/>
+            <w:vAlign w:val="bottom"/>
+            <w:hideMark/>
+          </w:tcPr>
+          <w:p>
+            <w:pPr>
+              <w:spacing w:line="240" w:lineRule="auto"/>
+              <w:ind w:firstLine="0"/>
+              <w:rPr>
+                <w:sz w:val="22"/>
+              </w:rPr>
+            </w:pPr>
+            <w:r>
+              <w:rPr>
+                <w:sz w:val="22"/>
+              </w:rPr>
+              <w:t>Database.TransactionManager</w:t>
+            </w:r>
+          </w:p>
+        </w:tc>
+        <w:tc>
+          <w:tcPr>
+            <w:tcW w:w="1871" w:type="dxa"/>
+            <w:vAlign w:val="bottom"/>
+            <w:hideMark/>
+          </w:tcPr>
+          <w:p>
+            <w:pPr>
+              <w:spacing w:line="240" w:lineRule="auto"/>
+              <w:ind w:firstLine="0"/>
+              <w:rPr>
+                <w:sz w:val="22"/>
+              </w:rPr>
+            </w:pPr>
+            <w:r>
+              <w:rPr>
+                <w:sz w:val="22"/>
+              </w:rPr>
+              <w:t>TransactionManager</w:t>
+            </w:r>
+          </w:p>
+        </w:tc>
+        <w:tc>
+          <w:tcPr>
+            <w:tcW w:w="3943" w:type="dxa"/>
+            <w:vAlign w:val="bottom"/>
+            <w:hideMark/>
+          </w:tcPr>
+          <w:p>
+            <w:pPr>
+              <w:spacing w:line="240" w:lineRule="auto"/>
+              <w:ind w:firstLine="0"/>
+              <w:rPr>
+                <w:sz w:val="22"/>
+              </w:rPr>
+            </w:pPr>
+            <w:r>
+              <w:rPr>
+                <w:sz w:val="22"/>
+              </w:rPr>
+              <w:t>Менеджер транзакций для безопасной работы с объектами БД</w:t>
+            </w:r>
+          </w:p>
+        </w:tc>
+      </w:tr>
+    </w:tbl>
+    <w:p/>
+    <w:p>
+      <w:pPr>
+        <w:spacing w:line="240" w:lineRule="auto"/>
+        <w:ind w:firstLine="0"/>
+      </w:pPr>
+      <w:r>
+        <w:t xml:space="preserve">Таблица </w:t>
+      </w:r>
+      <w:r>
+        <w:t>1</w:t>
+      </w:r>
+      <w:r>
+        <w:t>.2</w:t>
+      </w:r>
+      <w:r>
+        <w:t xml:space="preserve"> </w:t>
+      </w:r>
+      <w:r>
+        <w:t>– Используемые методы класса</w:t>
+      </w:r>
+      <w:r>
+        <w:t xml:space="preserve"> </w:t>
+      </w:r>
+      <w:r>
+        <w:t>Solid3d</w:t>
+      </w:r>
+      <w:r>
+        <w:t xml:space="preserve"> </w:t>
+      </w:r>
+      <w:r>
+        <w:t>(Teigha.DatabaseServices)</w:t>
+      </w:r>
+    </w:p>
+    <w:tbl>
+      <w:tblPr>
+        <w:tblW w:w="9345" w:type="dxa"/>
+        <w:tblBorders>
+          <w:top w:val="single" w:sz="4" w:space="0" w:color="auto"/>
+          <w:left w:val="single" w:sz="4" w:space="0" w:color="auto"/>
+          <w:bottom w:val="single" w:sz="4" w:space="0" w:color="auto"/>
+          <w:right w:val="single" w:sz="4" w:space="0" w:color="auto"/>
+          <w:insideH w:val="single" w:sz="4" w:space="0" w:color="auto"/>
+          <w:insideV w:val="single" w:sz="4" w:space="0" w:color="auto"/>
+        </w:tblBorders>
+        <w:tblCellMar>
+          <w:top w:w="15" w:type="dxa"/>
+          <w:left w:w="15" w:type="dxa"/>
+          <w:bottom w:w="15" w:type="dxa"/>
+          <w:right w:w="15" w:type="dxa"/>
+        </w:tblCellMar>
+        <w:tblLook w:val="04A0" w:firstRow="1" w:lastRow="0" w:firstColumn="1" w:lastColumn="0" w:noHBand="0" w:noVBand="1"/>
+      </w:tblPr>
+      <w:tblGrid>
+        <w:gridCol w:w="1685"/>
+        <w:gridCol w:w="2138"/>
+        <w:gridCol w:w="1484"/>
+        <w:gridCol w:w="4038"/>
+      </w:tblGrid>
+      <w:tr>
+        <w:trPr>
+          <w:tblHeader/>
+        </w:trPr>
+        <w:tc>
+          <w:tcPr>
+            <w:tcW w:w="1685" w:type="dxa"/>
+            <w:noWrap/>
+            <w:vAlign w:val="center"/>
+            <w:hideMark/>
+          </w:tcPr>
+          <w:p>
+            <w:pPr>
+              <w:spacing w:line="240" w:lineRule="auto"/>
+              <w:ind w:firstLine="0"/>
+              <w:jc w:val="center"/>
+              <w:rPr>
+                <w:sz w:val="22"/>
+              </w:rPr>
+            </w:pPr>
+            <w:r>
+              <w:rPr>
+                <w:sz w:val="22"/>
+              </w:rPr>
+              <w:t>Название</w:t>
+            </w:r>
+          </w:p>
+        </w:tc>
+        <w:tc>
+          <w:tcPr>
+            <w:tcW w:w="2138" w:type="dxa"/>
+            <w:noWrap/>
+            <w:vAlign w:val="center"/>
+            <w:hideMark/>
+          </w:tcPr>
+          <w:p>
+            <w:pPr>
+              <w:spacing w:line="240" w:lineRule="auto"/>
+              <w:ind w:firstLine="0"/>
+              <w:jc w:val="center"/>
+              <w:rPr>
+                <w:sz w:val="22"/>
+              </w:rPr>
+            </w:pPr>
+            <w:r>
+              <w:rPr>
+                <w:sz w:val="22"/>
+              </w:rPr>
+              <w:t>Входные параметры</w:t>
+            </w:r>
+          </w:p>
+        </w:tc>
+        <w:tc>
+          <w:tcPr>
+            <w:tcW w:w="1484" w:type="dxa"/>
+            <w:noWrap/>
+            <w:vAlign w:val="center"/>
+            <w:hideMark/>
+          </w:tcPr>
+          <w:p>
+            <w:pPr>
+              <w:spacing w:line="240" w:lineRule="auto"/>
+              <w:ind w:firstLine="0"/>
+              <w:jc w:val="center"/>
+              <w:rPr>
+                <w:sz w:val="22"/>
+              </w:rPr>
+            </w:pPr>
+            <w:r>
+              <w:rPr>
+                <w:sz w:val="22"/>
+              </w:rPr>
+              <w:t>Тип возвращаемых данных</w:t>
+            </w:r>
+          </w:p>
+        </w:tc>
+        <w:tc>
+          <w:tcPr>
+            <w:tcW w:w="4038" w:type="dxa"/>
+            <w:noWrap/>
+            <w:vAlign w:val="center"/>
+            <w:hideMark/>
+          </w:tcPr>
+          <w:p>
+            <w:pPr>
+              <w:spacing w:line="240" w:lineRule="auto"/>
+              <w:ind w:firstLine="0"/>
+              <w:jc w:val="center"/>
+              <w:rPr>
+                <w:sz w:val="22"/>
+              </w:rPr>
+            </w:pPr>
+            <w:r>
+              <w:rPr>
+                <w:sz w:val="22"/>
+              </w:rPr>
+              <w:t>Описание</w:t>
+            </w:r>
+          </w:p>
+        </w:tc>
+      </w:tr>
+      <w:tr>
+        <w:tc>
+          <w:tcPr>
+            <w:tcW w:w="1685" w:type="dxa"/>
+            <w:vAlign w:val="bottom"/>
+            <w:hideMark/>
+          </w:tcPr>
+          <w:p>
+            <w:pPr>
+              <w:spacing w:line="240" w:lineRule="auto"/>
+              <w:ind w:firstLine="0"/>
+              <w:rPr>
+                <w:sz w:val="22"/>
+              </w:rPr>
+            </w:pPr>
+            <w:r>
+              <w:rPr>
+                <w:sz w:val="22"/>
+              </w:rPr>
+              <w:t>CreateFrustum</w:t>
+            </w:r>
+          </w:p>
+        </w:tc>
+        <w:tc>
+          <w:tcPr>
+            <w:tcW w:w="2138" w:type="dxa"/>
+            <w:vAlign w:val="bottom"/>
+            <w:hideMark/>
+          </w:tcPr>
+          <w:p>
+            <w:pPr>
+              <w:spacing w:line="240" w:lineRule="auto"/>
+              <w:ind w:firstLine="0"/>
+              <w:rPr>
+                <w:sz w:val="22"/>
+              </w:rPr>
+            </w:pPr>
+            <w:r>
+              <w:rPr>
+                <w:sz w:val="22"/>
+              </w:rPr>
+              <w:t>(параметры высоты и радиусов)</w:t>
+            </w:r>
+          </w:p>
+        </w:tc>
+        <w:tc>
+          <w:tcPr>
+            <w:tcW w:w="1484" w:type="dxa"/>
+            <w:vAlign w:val="bottom"/>
+            <w:hideMark/>
+          </w:tcPr>
+          <w:p>
+            <w:pPr>
+              <w:spacing w:line="240" w:lineRule="auto"/>
+              <w:ind w:firstLine="0"/>
+              <w:rPr>
+                <w:sz w:val="22"/>
+              </w:rPr>
+            </w:pPr>
+            <w:r>
+              <w:rPr>
+                <w:sz w:val="22"/>
+              </w:rPr>
+              <w:t>void</w:t>
+            </w:r>
+          </w:p>
+        </w:tc>
+        <w:tc>
+          <w:tcPr>
+            <w:tcW w:w="4038" w:type="dxa"/>
+            <w:vAlign w:val="bottom"/>
+            <w:hideMark/>
+          </w:tcPr>
+          <w:p>
+            <w:pPr>
+              <w:spacing w:line="240" w:lineRule="auto"/>
+              <w:ind w:firstLine="0"/>
+              <w:rPr>
+                <w:sz w:val="22"/>
+              </w:rPr>
+            </w:pPr>
+            <w:r>
+              <w:rPr>
+                <w:sz w:val="22"/>
+              </w:rPr>
+              <w:t>Создаёт 3D</w:t>
+            </w:r>
+            <w:r>
+              <w:rPr>
+                <w:sz w:val="22"/>
+              </w:rPr>
+              <w:noBreakHyphen/>
+              <w:t>тело типа усечённого конуса; при равных радиусах используется как цилиндр (для внешнего и внутреннего цилиндра шайбы)</w:t>
+            </w:r>
+          </w:p>
+        </w:tc>
+      </w:tr>
+      <w:tr>
+        <w:tc>
+          <w:tcPr>
+            <w:tcW w:w="1685" w:type="dxa"/>
+            <w:vAlign w:val="bottom"/>
+            <w:hideMark/>
+          </w:tcPr>
+          <w:p>
+            <w:pPr>
+              <w:spacing w:line="240" w:lineRule="auto"/>
+              <w:ind w:firstLine="0"/>
+              <w:rPr>
+                <w:sz w:val="22"/>
+              </w:rPr>
+            </w:pPr>
+            <w:r>
+              <w:rPr>
+                <w:sz w:val="22"/>
+              </w:rPr>
+              <w:t>BooleanOperation</w:t>
+            </w:r>
+          </w:p>
+        </w:tc>
+        <w:tc>
+          <w:tcPr>
+            <w:tcW w:w="2138" w:type="dxa"/>
+            <w:vAlign w:val="bottom"/>
+            <w:hideMark/>
+          </w:tcPr>
+          <w:p>
+            <w:pPr>
+              <w:spacing w:line="240" w:lineRule="auto"/>
+              <w:ind w:firstLine="0"/>
+              <w:rPr>
+                <w:sz w:val="22"/>
+              </w:rPr>
+            </w:pPr>
+            <w:r>
+              <w:rPr>
+                <w:sz w:val="22"/>
+              </w:rPr>
+              <w:t>BooleanOperationType operation,</w:t>
+            </w:r>
+          </w:p>
+          <w:p>
+            <w:pPr>
+              <w:spacing w:line="240" w:lineRule="auto"/>
+              <w:ind w:firstLine="0"/>
+              <w:rPr>
+                <w:sz w:val="22"/>
+              </w:rPr>
+            </w:pPr>
+            <w:r>
+              <w:rPr>
+                <w:sz w:val="22"/>
+              </w:rPr>
+              <w:t>Solid3d other</w:t>
+            </w:r>
+          </w:p>
+        </w:tc>
+        <w:tc>
+          <w:tcPr>
+            <w:tcW w:w="1484" w:type="dxa"/>
+            <w:vAlign w:val="bottom"/>
+            <w:hideMark/>
+          </w:tcPr>
+          <w:p>
+            <w:pPr>
+              <w:spacing w:line="240" w:lineRule="auto"/>
+              <w:ind w:firstLine="0"/>
+              <w:rPr>
+                <w:sz w:val="22"/>
+              </w:rPr>
+            </w:pPr>
+            <w:r>
+              <w:rPr>
+                <w:sz w:val="22"/>
+              </w:rPr>
+              <w:t>void</w:t>
+            </w:r>
+          </w:p>
+        </w:tc>
+        <w:tc>
+          <w:tcPr>
+            <w:tcW w:w="4038" w:type="dxa"/>
+            <w:vAlign w:val="bottom"/>
+            <w:hideMark/>
+          </w:tcPr>
+          <w:p>
+            <w:pPr>
+              <w:spacing w:line="240" w:lineRule="auto"/>
+              <w:ind w:firstLine="0"/>
+              <w:rPr>
+                <w:sz w:val="22"/>
+              </w:rPr>
+            </w:pPr>
+            <w:r>
+              <w:rPr>
+                <w:sz w:val="22"/>
+              </w:rPr>
+              <w:t>Выполняет логическую операцию над телами (объединение/пересечение/вычитание). В проекте используется вычитание внутреннего цилиндра из внешнего</w:t>
+            </w:r>
+          </w:p>
+        </w:tc>
+      </w:tr>
+    </w:tbl>
+    <w:p>
+      <w:pPr>
+        <w:ind w:firstLine="0"/>
+        <w:rPr>
+          <w:b/>
+          <w:bCs/>
+          <w:lang w:val="en-US"/>
+        </w:rPr>
+      </w:pPr>
+    </w:p>
+    <w:p>
+      <w:pPr>
+        <w:spacing w:line="240" w:lineRule="auto"/>
+        <w:ind w:firstLine="0"/>
+      </w:pPr>
+      <w:r>
+        <w:t xml:space="preserve">Таблица </w:t>
+      </w:r>
+      <w:r>
+        <w:t>1</w:t>
+      </w:r>
+      <w:r>
+        <w:t>.</w:t>
+      </w:r>
+      <w:r>
+        <w:t>3</w:t>
+      </w:r>
+      <w:r>
+        <w:t xml:space="preserve"> –</w:t>
+      </w:r>
+      <w:r>
+        <w:t xml:space="preserve"> Используемые члены перечисленияBooleanOperationType</w:t>
+      </w:r>
+    </w:p>
+    <w:tbl>
+      <w:tblPr>
+        <w:tblW w:w="9069" w:type="dxa"/>
+        <w:tblBorders>
+          <w:top w:val="single" w:sz="4" w:space="0" w:color="auto"/>
+          <w:left w:val="single" w:sz="4" w:space="0" w:color="auto"/>
+          <w:bottom w:val="single" w:sz="4" w:space="0" w:color="auto"/>
+          <w:right w:val="single" w:sz="4" w:space="0" w:color="auto"/>
+          <w:insideH w:val="single" w:sz="4" w:space="0" w:color="auto"/>
+          <w:insideV w:val="single" w:sz="4" w:space="0" w:color="auto"/>
+        </w:tblBorders>
+        <w:tblCellMar>
+          <w:top w:w="15" w:type="dxa"/>
+          <w:left w:w="15" w:type="dxa"/>
+          <w:bottom w:w="15" w:type="dxa"/>
+          <w:right w:w="15" w:type="dxa"/>
+        </w:tblCellMar>
+        <w:tblLook w:val="04A0" w:firstRow="1" w:lastRow="0" w:firstColumn="1" w:lastColumn="0" w:noHBand="0" w:noVBand="1"/>
+      </w:tblPr>
+      <w:tblGrid>
+        <w:gridCol w:w="1737"/>
+        <w:gridCol w:w="2992"/>
+        <w:gridCol w:w="4340"/>
+      </w:tblGrid>
+      <w:tr>
+        <w:trPr>
+          <w:tblHeader/>
+        </w:trPr>
+        <w:tc>
+          <w:tcPr>
+            <w:tcW w:w="0" w:type="auto"/>
+            <w:noWrap/>
+            <w:vAlign w:val="center"/>
+            <w:hideMark/>
+          </w:tcPr>
+          <w:p>
+            <w:pPr>
+              <w:spacing w:line="240" w:lineRule="auto"/>
+              <w:ind w:firstLine="0"/>
+              <w:jc w:val="center"/>
+              <w:rPr>
+                <w:sz w:val="22"/>
+              </w:rPr>
+            </w:pPr>
+            <w:r>
+              <w:rPr>
+                <w:sz w:val="22"/>
+              </w:rPr>
+              <w:t>Название</w:t>
+            </w:r>
+          </w:p>
+        </w:tc>
+        <w:tc>
+          <w:tcPr>
+            <w:tcW w:w="0" w:type="auto"/>
+            <w:noWrap/>
+            <w:vAlign w:val="center"/>
+            <w:hideMark/>
+          </w:tcPr>
+          <w:p>
+            <w:pPr>
+              <w:spacing w:line="240" w:lineRule="auto"/>
+              <w:ind w:firstLine="0"/>
+              <w:jc w:val="center"/>
+              <w:rPr>
+                <w:sz w:val="22"/>
+              </w:rPr>
+            </w:pPr>
+            <w:r>
+              <w:rPr>
+                <w:sz w:val="22"/>
+              </w:rPr>
+              <w:t>Тип данных</w:t>
+            </w:r>
+          </w:p>
+        </w:tc>
+        <w:tc>
+          <w:tcPr>
+            <w:tcW w:w="4340" w:type="dxa"/>
+            <w:noWrap/>
+            <w:vAlign w:val="center"/>
+            <w:hideMark/>
+          </w:tcPr>
+          <w:p>
+            <w:pPr>
+              <w:spacing w:line="240" w:lineRule="auto"/>
+              <w:ind w:firstLine="0"/>
+              <w:jc w:val="center"/>
+              <w:rPr>
+                <w:sz w:val="22"/>
+              </w:rPr>
+            </w:pPr>
+            <w:r>
+              <w:rPr>
+                <w:sz w:val="22"/>
+              </w:rPr>
+              <w:t>Описание</w:t>
+            </w:r>
+          </w:p>
+        </w:tc>
+      </w:tr>
+      <w:tr>
+        <w:tc>
+          <w:tcPr>
+            <w:tcW w:w="0" w:type="auto"/>
+            <w:vAlign w:val="bottom"/>
+            <w:hideMark/>
+          </w:tcPr>
+          <w:p>
+            <w:pPr>
+              <w:spacing w:line="240" w:lineRule="auto"/>
+              <w:ind w:firstLine="0"/>
+              <w:rPr>
+                <w:sz w:val="22"/>
+              </w:rPr>
+            </w:pPr>
+            <w:r>
+              <w:rPr>
+                <w:sz w:val="22"/>
+              </w:rPr>
+              <w:t>BoolUnite</w:t>
+            </w:r>
+          </w:p>
+        </w:tc>
+        <w:tc>
+          <w:tcPr>
+            <w:tcW w:w="0" w:type="auto"/>
+            <w:vAlign w:val="bottom"/>
+            <w:hideMark/>
+          </w:tcPr>
+          <w:p>
+            <w:pPr>
+              <w:spacing w:line="240" w:lineRule="auto"/>
+              <w:ind w:firstLine="0"/>
+              <w:rPr>
+                <w:sz w:val="22"/>
+              </w:rPr>
+            </w:pPr>
+            <w:r>
+              <w:rPr>
+                <w:sz w:val="22"/>
+              </w:rPr>
+              <w:t>BooleanOperationType</w:t>
+            </w:r>
+          </w:p>
+        </w:tc>
+        <w:tc>
+          <w:tcPr>
+            <w:tcW w:w="4340" w:type="dxa"/>
+            <w:vAlign w:val="bottom"/>
+            <w:hideMark/>
+          </w:tcPr>
+          <w:p>
+            <w:pPr>
+              <w:spacing w:line="240" w:lineRule="auto"/>
+              <w:ind w:firstLine="0"/>
+              <w:rPr>
+                <w:sz w:val="22"/>
+              </w:rPr>
+            </w:pPr>
+            <w:r>
+              <w:rPr>
+                <w:sz w:val="22"/>
+              </w:rPr>
+              <w:t>Логическая операция объединения</w:t>
+            </w:r>
+          </w:p>
+        </w:tc>
+      </w:tr>
+      <w:tr>
+        <w:tc>
+          <w:tcPr>
+            <w:tcW w:w="0" w:type="auto"/>
+            <w:vAlign w:val="bottom"/>
+            <w:hideMark/>
+          </w:tcPr>
+          <w:p>
+            <w:pPr>
+              <w:spacing w:line="240" w:lineRule="auto"/>
+              <w:ind w:firstLine="0"/>
+              <w:rPr>
+                <w:sz w:val="22"/>
+              </w:rPr>
+            </w:pPr>
+            <w:r>
+              <w:rPr>
+                <w:sz w:val="22"/>
+              </w:rPr>
+              <w:t>BoolIntersect</w:t>
+            </w:r>
+          </w:p>
+        </w:tc>
+        <w:tc>
+          <w:tcPr>
+            <w:tcW w:w="0" w:type="auto"/>
+            <w:vAlign w:val="bottom"/>
+            <w:hideMark/>
+          </w:tcPr>
+          <w:p>
+            <w:pPr>
+              <w:spacing w:line="240" w:lineRule="auto"/>
+              <w:ind w:firstLine="0"/>
+              <w:rPr>
+                <w:sz w:val="22"/>
+              </w:rPr>
+            </w:pPr>
+            <w:r>
+              <w:rPr>
+                <w:sz w:val="22"/>
+              </w:rPr>
+              <w:t>BooleanOperationType</w:t>
+            </w:r>
+          </w:p>
+        </w:tc>
+        <w:tc>
+          <w:tcPr>
+            <w:tcW w:w="4340" w:type="dxa"/>
+            <w:vAlign w:val="bottom"/>
+            <w:hideMark/>
+          </w:tcPr>
+          <w:p>
+            <w:pPr>
+              <w:spacing w:line="240" w:lineRule="auto"/>
+              <w:ind w:firstLine="0"/>
+              <w:rPr>
+                <w:sz w:val="22"/>
+              </w:rPr>
+            </w:pPr>
+            <w:r>
+              <w:rPr>
+                <w:sz w:val="22"/>
+              </w:rPr>
+              <w:t>Логическая операция пересечения</w:t>
+            </w:r>
+          </w:p>
+        </w:tc>
+      </w:tr>
+      <w:tr>
+        <w:tc>
+          <w:tcPr>
+            <w:tcW w:w="0" w:type="auto"/>
+            <w:vAlign w:val="bottom"/>
+            <w:hideMark/>
+          </w:tcPr>
+          <w:p>
+            <w:pPr>
+              <w:spacing w:line="240" w:lineRule="auto"/>
+              <w:ind w:firstLine="0"/>
+              <w:rPr>
+                <w:sz w:val="22"/>
+              </w:rPr>
+            </w:pPr>
+            <w:r>
+              <w:rPr>
+                <w:sz w:val="22"/>
+              </w:rPr>
+              <w:t>BoolSubtract</w:t>
+            </w:r>
+          </w:p>
+        </w:tc>
+        <w:tc>
+          <w:tcPr>
+            <w:tcW w:w="0" w:type="auto"/>
+            <w:vAlign w:val="bottom"/>
+            <w:hideMark/>
+          </w:tcPr>
+          <w:p>
+            <w:pPr>
+              <w:spacing w:line="240" w:lineRule="auto"/>
+              <w:ind w:firstLine="0"/>
+              <w:rPr>
+                <w:sz w:val="22"/>
+              </w:rPr>
+            </w:pPr>
+            <w:r>
+              <w:rPr>
+                <w:sz w:val="22"/>
+              </w:rPr>
+              <w:t>BooleanOperationType</w:t>
+            </w:r>
+          </w:p>
+        </w:tc>
+        <w:tc>
+          <w:tcPr>
+            <w:tcW w:w="4340" w:type="dxa"/>
+            <w:vAlign w:val="bottom"/>
+            <w:hideMark/>
+          </w:tcPr>
+          <w:p>
+            <w:pPr>
+              <w:spacing w:line="240" w:lineRule="auto"/>
+              <w:ind w:firstLine="0"/>
+              <w:rPr>
+                <w:sz w:val="22"/>
+              </w:rPr>
+            </w:pPr>
+            <w:r>
+              <w:rPr>
+                <w:sz w:val="22"/>
+              </w:rPr>
+              <w:t>Логическая операция вычитания (используется для создания отверстия)</w:t>
+            </w:r>
+          </w:p>
+        </w:tc>
+      </w:tr>
+    </w:tbl>
+    <w:p/>
+    <w:p>
+      <w:pPr>
+        <w:spacing w:line="240" w:lineRule="auto"/>
+        <w:ind w:firstLine="0"/>
+      </w:pPr>
+      <w:r>
+        <w:t xml:space="preserve">Таблица </w:t>
+      </w:r>
+      <w:r>
+        <w:t>1</w:t>
+      </w:r>
+      <w:r>
+        <w:t>.4 – Используемые методы класса</w:t>
+      </w:r>
+      <w:r>
+        <w:t xml:space="preserve"> </w:t>
+      </w:r>
+      <w:r>
+        <w:t>Transaction</w:t>
+      </w:r>
+      <w:r>
+        <w:t xml:space="preserve"> </w:t>
+      </w:r>
+      <w:r>
+        <w:t>(Teigha.DatabaseServices)</w:t>
+      </w:r>
+    </w:p>
+    <w:tbl>
+      <w:tblPr>
+        <w:tblW w:w="9345" w:type="dxa"/>
+        <w:tblBorders>
+          <w:top w:val="single" w:sz="4" w:space="0" w:color="auto"/>
+          <w:left w:val="single" w:sz="4" w:space="0" w:color="auto"/>
+          <w:bottom w:val="single" w:sz="4" w:space="0" w:color="auto"/>
+          <w:right w:val="single" w:sz="4" w:space="0" w:color="auto"/>
+          <w:insideH w:val="single" w:sz="4" w:space="0" w:color="auto"/>
+          <w:insideV w:val="single" w:sz="4" w:space="0" w:color="auto"/>
+        </w:tblBorders>
+        <w:tblLayout w:type="fixed"/>
+        <w:tblCellMar>
+          <w:top w:w="15" w:type="dxa"/>
+          <w:left w:w="15" w:type="dxa"/>
+          <w:bottom w:w="15" w:type="dxa"/>
+          <w:right w:w="15" w:type="dxa"/>
+        </w:tblCellMar>
+        <w:tblLook w:val="04A0" w:firstRow="1" w:lastRow="0" w:firstColumn="1" w:lastColumn="0" w:noHBand="0" w:noVBand="1"/>
+      </w:tblPr>
+      <w:tblGrid>
+        <w:gridCol w:w="1696"/>
+        <w:gridCol w:w="1134"/>
+        <w:gridCol w:w="1560"/>
+        <w:gridCol w:w="4955"/>
+      </w:tblGrid>
+      <w:tr>
+        <w:trPr>
+          <w:tblHeader/>
+        </w:trPr>
+        <w:tc>
+          <w:tcPr>
+            <w:tcW w:w="1696" w:type="dxa"/>
+            <w:noWrap/>
+            <w:vAlign w:val="center"/>
+            <w:hideMark/>
+          </w:tcPr>
+          <w:p>
+            <w:pPr>
+              <w:spacing w:line="240" w:lineRule="auto"/>
+              <w:ind w:firstLine="0"/>
+              <w:jc w:val="center"/>
+              <w:rPr>
+                <w:sz w:val="22"/>
+              </w:rPr>
+            </w:pPr>
+            <w:r>
+              <w:rPr>
+                <w:sz w:val="22"/>
+              </w:rPr>
+              <w:t>Название</w:t>
+            </w:r>
+          </w:p>
+        </w:tc>
+        <w:tc>
+          <w:tcPr>
+            <w:tcW w:w="1134" w:type="dxa"/>
+            <w:noWrap/>
+            <w:vAlign w:val="center"/>
+            <w:hideMark/>
+          </w:tcPr>
+          <w:p>
+            <w:pPr>
+              <w:spacing w:line="240" w:lineRule="auto"/>
+              <w:ind w:firstLine="0"/>
+              <w:jc w:val="center"/>
+              <w:rPr>
+                <w:sz w:val="22"/>
+              </w:rPr>
+            </w:pPr>
+            <w:r>
+              <w:rPr>
+                <w:sz w:val="22"/>
+              </w:rPr>
+              <w:t>Входные параметры</w:t>
+            </w:r>
+          </w:p>
+        </w:tc>
+        <w:tc>
+          <w:tcPr>
+            <w:tcW w:w="1560" w:type="dxa"/>
+            <w:noWrap/>
+            <w:vAlign w:val="center"/>
+            <w:hideMark/>
+          </w:tcPr>
+          <w:p>
+            <w:pPr>
+              <w:spacing w:line="240" w:lineRule="auto"/>
+              <w:ind w:firstLine="0"/>
+              <w:jc w:val="center"/>
+              <w:rPr>
+                <w:sz w:val="22"/>
+              </w:rPr>
+            </w:pPr>
+            <w:r>
+              <w:rPr>
+                <w:sz w:val="22"/>
+              </w:rPr>
+              <w:t>Тип возвращаемых данных</w:t>
+            </w:r>
+          </w:p>
+        </w:tc>
+        <w:tc>
+          <w:tcPr>
+            <w:tcW w:w="4955" w:type="dxa"/>
+            <w:noWrap/>
+            <w:vAlign w:val="center"/>
+            <w:hideMark/>
+          </w:tcPr>
+          <w:p>
+            <w:pPr>
+              <w:spacing w:line="240" w:lineRule="auto"/>
+              <w:ind w:firstLine="0"/>
+              <w:jc w:val="center"/>
+              <w:rPr>
+                <w:sz w:val="22"/>
+              </w:rPr>
+            </w:pPr>
+            <w:r>
+              <w:rPr>
+                <w:sz w:val="22"/>
+              </w:rPr>
+              <w:t>Описание</w:t>
+            </w:r>
+          </w:p>
+        </w:tc>
+      </w:tr>
+      <w:tr>
+        <w:tc>
+          <w:tcPr>
+            <w:tcW w:w="1696" w:type="dxa"/>
+            <w:vAlign w:val="bottom"/>
+            <w:hideMark/>
+          </w:tcPr>
+          <w:p>
+            <w:pPr>
+              <w:spacing w:line="240" w:lineRule="auto"/>
+              <w:ind w:firstLine="0"/>
+              <w:rPr>
+                <w:sz w:val="22"/>
+              </w:rPr>
+            </w:pPr>
+            <w:r>
+              <w:rPr>
+                <w:sz w:val="22"/>
+              </w:rPr>
+              <w:t>GetObject</w:t>
+            </w:r>
+          </w:p>
+        </w:tc>
+        <w:tc>
+          <w:tcPr>
+            <w:tcW w:w="1134" w:type="dxa"/>
+            <w:vAlign w:val="bottom"/>
+            <w:hideMark/>
+          </w:tcPr>
+          <w:p>
+            <w:pPr>
+              <w:spacing w:line="240" w:lineRule="auto"/>
+              <w:ind w:firstLine="0"/>
+              <w:rPr>
+                <w:sz w:val="22"/>
+              </w:rPr>
+            </w:pPr>
+            <w:r>
+              <w:rPr>
+                <w:sz w:val="22"/>
+              </w:rPr>
+              <w:t>(идентификатор объекта, режим открытия)</w:t>
+            </w:r>
+          </w:p>
+        </w:tc>
+        <w:tc>
+          <w:tcPr>
+            <w:tcW w:w="1560" w:type="dxa"/>
+            <w:vAlign w:val="bottom"/>
+            <w:hideMark/>
+          </w:tcPr>
+          <w:p>
+            <w:pPr>
+              <w:spacing w:line="240" w:lineRule="auto"/>
+              <w:ind w:firstLine="0"/>
+              <w:rPr>
+                <w:sz w:val="22"/>
+              </w:rPr>
+            </w:pPr>
+            <w:r>
+              <w:rPr>
+                <w:sz w:val="22"/>
+              </w:rPr>
+              <w:t>объект БД</w:t>
+            </w:r>
+          </w:p>
+        </w:tc>
+        <w:tc>
+          <w:tcPr>
+            <w:tcW w:w="4955" w:type="dxa"/>
+            <w:vAlign w:val="bottom"/>
+            <w:hideMark/>
+          </w:tcPr>
+          <w:p>
+            <w:pPr>
+              <w:spacing w:line="240" w:lineRule="auto"/>
+              <w:ind w:firstLine="0"/>
+              <w:rPr>
+                <w:sz w:val="22"/>
+              </w:rPr>
+            </w:pPr>
+            <w:r>
+              <w:rPr>
+                <w:sz w:val="22"/>
+              </w:rPr>
+              <w:t>Получение объекта БД чертежа по идентификатору (например, получение BlockTableRecord для добавления сущностей)</w:t>
+            </w:r>
+          </w:p>
+        </w:tc>
+      </w:tr>
+      <w:tr>
+        <w:tc>
+          <w:tcPr>
+            <w:tcW w:w="1696" w:type="dxa"/>
+            <w:vAlign w:val="bottom"/>
+            <w:hideMark/>
+          </w:tcPr>
+          <w:p>
+            <w:pPr>
+              <w:spacing w:line="240" w:lineRule="auto"/>
+              <w:ind w:firstLine="0"/>
+              <w:rPr>
+                <w:sz w:val="22"/>
+              </w:rPr>
+            </w:pPr>
+            <w:r>
+              <w:rPr>
+                <w:sz w:val="22"/>
+              </w:rPr>
+              <w:lastRenderedPageBreak/>
+              <w:t>AddNewlyCreatedDBObject</w:t>
+            </w:r>
+          </w:p>
+        </w:tc>
+        <w:tc>
+          <w:tcPr>
+            <w:tcW w:w="1134" w:type="dxa"/>
+            <w:vAlign w:val="bottom"/>
+            <w:hideMark/>
+          </w:tcPr>
+          <w:p>
+            <w:pPr>
+              <w:spacing w:line="240" w:lineRule="auto"/>
+              <w:ind w:firstLine="0"/>
+              <w:rPr>
+                <w:sz w:val="22"/>
+              </w:rPr>
+            </w:pPr>
+            <w:r>
+              <w:rPr>
+                <w:sz w:val="22"/>
+              </w:rPr>
+              <w:t>DBObject obj, bool add</w:t>
+            </w:r>
+          </w:p>
+        </w:tc>
+        <w:tc>
+          <w:tcPr>
+            <w:tcW w:w="1560" w:type="dxa"/>
+            <w:vAlign w:val="bottom"/>
+            <w:hideMark/>
+          </w:tcPr>
+          <w:p>
+            <w:pPr>
+              <w:spacing w:line="240" w:lineRule="auto"/>
+              <w:ind w:firstLine="0"/>
+              <w:rPr>
+                <w:sz w:val="22"/>
+              </w:rPr>
+            </w:pPr>
+            <w:r>
+              <w:rPr>
+                <w:sz w:val="22"/>
+              </w:rPr>
+              <w:t>void</w:t>
+            </w:r>
+          </w:p>
+        </w:tc>
+        <w:tc>
+          <w:tcPr>
+            <w:tcW w:w="4955" w:type="dxa"/>
+            <w:vAlign w:val="bottom"/>
+            <w:hideMark/>
+          </w:tcPr>
+          <w:p>
+            <w:pPr>
+              <w:spacing w:line="240" w:lineRule="auto"/>
+              <w:ind w:firstLine="0"/>
+              <w:rPr>
+                <w:sz w:val="22"/>
+              </w:rPr>
+            </w:pPr>
+            <w:r>
+              <w:rPr>
+                <w:sz w:val="22"/>
+              </w:rPr>
+              <w:t>Регистрирует вновь созданный объект в текущей транзакции</w:t>
+            </w:r>
+          </w:p>
+        </w:tc>
+      </w:tr>
+      <w:tr>
+        <w:tc>
+          <w:tcPr>
+            <w:tcW w:w="1696" w:type="dxa"/>
+            <w:vAlign w:val="bottom"/>
+            <w:hideMark/>
+          </w:tcPr>
+          <w:p>
+            <w:pPr>
+              <w:spacing w:line="240" w:lineRule="auto"/>
+              <w:ind w:firstLine="0"/>
+              <w:rPr>
+                <w:sz w:val="22"/>
+              </w:rPr>
+            </w:pPr>
+            <w:r>
+              <w:rPr>
+                <w:sz w:val="22"/>
+              </w:rPr>
+              <w:t>Commit</w:t>
+            </w:r>
+          </w:p>
+        </w:tc>
+        <w:tc>
+          <w:tcPr>
+            <w:tcW w:w="1134" w:type="dxa"/>
+            <w:vAlign w:val="bottom"/>
+            <w:hideMark/>
+          </w:tcPr>
+          <w:p>
+            <w:pPr>
+              <w:spacing w:line="240" w:lineRule="auto"/>
+              <w:ind w:firstLine="0"/>
+              <w:rPr>
+                <w:sz w:val="22"/>
+              </w:rPr>
+            </w:pPr>
+            <w:r>
+              <w:rPr>
+                <w:sz w:val="22"/>
+              </w:rPr>
+              <w:t>—</w:t>
+            </w:r>
+          </w:p>
+        </w:tc>
+        <w:tc>
+          <w:tcPr>
+            <w:tcW w:w="1560" w:type="dxa"/>
+            <w:vAlign w:val="bottom"/>
+            <w:hideMark/>
+          </w:tcPr>
+          <w:p>
+            <w:pPr>
+              <w:spacing w:line="240" w:lineRule="auto"/>
+              <w:ind w:firstLine="0"/>
+              <w:rPr>
+                <w:sz w:val="22"/>
+              </w:rPr>
+            </w:pPr>
+            <w:r>
+              <w:rPr>
+                <w:sz w:val="22"/>
+              </w:rPr>
+              <w:t>void</w:t>
+            </w:r>
+          </w:p>
+        </w:tc>
+        <w:tc>
+          <w:tcPr>
+            <w:tcW w:w="4955" w:type="dxa"/>
+            <w:vAlign w:val="bottom"/>
+            <w:hideMark/>
+          </w:tcPr>
+          <w:p>
+            <w:pPr>
+              <w:spacing w:line="240" w:lineRule="auto"/>
+              <w:ind w:firstLine="0"/>
+              <w:rPr>
+                <w:sz w:val="22"/>
+              </w:rPr>
+            </w:pPr>
+            <w:r>
+              <w:rPr>
+                <w:sz w:val="22"/>
+              </w:rPr>
+              <w:t>Фиксирует изменения и завершает транзакцию</w:t>
+            </w:r>
+          </w:p>
+        </w:tc>
+      </w:tr>
+      <w:tr>
+        <w:tc>
+          <w:tcPr>
+            <w:tcW w:w="1696" w:type="dxa"/>
+            <w:vAlign w:val="bottom"/>
+            <w:hideMark/>
+          </w:tcPr>
+          <w:p>
+            <w:pPr>
+              <w:spacing w:line="240" w:lineRule="auto"/>
+              <w:ind w:firstLine="0"/>
+              <w:rPr>
+                <w:sz w:val="22"/>
+              </w:rPr>
+            </w:pPr>
+            <w:r>
+              <w:rPr>
+                <w:sz w:val="22"/>
+              </w:rPr>
+              <w:t>Abort</w:t>
+            </w:r>
+          </w:p>
+        </w:tc>
+        <w:tc>
+          <w:tcPr>
+            <w:tcW w:w="1134" w:type="dxa"/>
+            <w:vAlign w:val="bottom"/>
+            <w:hideMark/>
+          </w:tcPr>
+          <w:p>
+            <w:pPr>
+              <w:spacing w:line="240" w:lineRule="auto"/>
+              <w:ind w:firstLine="0"/>
+              <w:rPr>
+                <w:sz w:val="22"/>
+              </w:rPr>
+            </w:pPr>
+            <w:r>
+              <w:rPr>
+                <w:sz w:val="22"/>
+              </w:rPr>
+              <w:t>—</w:t>
+            </w:r>
+          </w:p>
+        </w:tc>
+        <w:tc>
+          <w:tcPr>
+            <w:tcW w:w="1560" w:type="dxa"/>
+            <w:vAlign w:val="bottom"/>
+            <w:hideMark/>
+          </w:tcPr>
+          <w:p>
+            <w:pPr>
+              <w:spacing w:line="240" w:lineRule="auto"/>
+              <w:ind w:firstLine="0"/>
+              <w:rPr>
+                <w:sz w:val="22"/>
+              </w:rPr>
+            </w:pPr>
+            <w:r>
+              <w:rPr>
+                <w:sz w:val="22"/>
+              </w:rPr>
+              <w:t>void</w:t>
+            </w:r>
+          </w:p>
+        </w:tc>
+        <w:tc>
+          <w:tcPr>
+            <w:tcW w:w="4955" w:type="dxa"/>
+            <w:vAlign w:val="bottom"/>
+            <w:hideMark/>
+          </w:tcPr>
+          <w:p>
+            <w:pPr>
+              <w:spacing w:line="240" w:lineRule="auto"/>
+              <w:ind w:firstLine="0"/>
+              <w:rPr>
+                <w:sz w:val="22"/>
+              </w:rPr>
+            </w:pPr>
+            <w:r>
+              <w:rPr>
+                <w:sz w:val="22"/>
+              </w:rPr>
+              <w:t>Прерывает транзакцию без применения изменений</w:t>
+            </w:r>
+          </w:p>
+        </w:tc>
+      </w:tr>
+    </w:tbl>
+    <w:p/>
+    <w:p>
+      <w:pPr>
+        <w:ind w:firstLine="0"/>
+      </w:pPr>
+      <w:r>
+        <w:t xml:space="preserve">Таблица </w:t>
+      </w:r>
+      <w:r>
+        <w:t>1</w:t>
+      </w:r>
+      <w:r>
+        <w:t>.5 – Используемые методы класса</w:t>
+      </w:r>
+      <w:r>
+        <w:t xml:space="preserve"> </w:t>
+      </w:r>
+      <w:r>
+        <w:t>TransactionManager</w:t>
+      </w:r>
+    </w:p>
+    <w:tbl>
+      <w:tblPr>
+        <w:tblW w:w="9351" w:type="dxa"/>
+        <w:tblBorders>
+          <w:top w:val="single" w:sz="4" w:space="0" w:color="auto"/>
+          <w:left w:val="single" w:sz="4" w:space="0" w:color="auto"/>
+          <w:bottom w:val="single" w:sz="4" w:space="0" w:color="auto"/>
+          <w:right w:val="single" w:sz="4" w:space="0" w:color="auto"/>
+          <w:insideH w:val="single" w:sz="4" w:space="0" w:color="auto"/>
+          <w:insideV w:val="single" w:sz="4" w:space="0" w:color="auto"/>
+        </w:tblBorders>
+        <w:tblLayout w:type="fixed"/>
+        <w:tblCellMar>
+          <w:top w:w="15" w:type="dxa"/>
+          <w:left w:w="15" w:type="dxa"/>
+          <w:bottom w:w="15" w:type="dxa"/>
+          <w:right w:w="15" w:type="dxa"/>
+        </w:tblCellMar>
+        <w:tblLook w:val="04A0" w:firstRow="1" w:lastRow="0" w:firstColumn="1" w:lastColumn="0" w:noHBand="0" w:noVBand="1"/>
+      </w:tblPr>
+      <w:tblGrid>
+        <w:gridCol w:w="1696"/>
+        <w:gridCol w:w="1134"/>
+        <w:gridCol w:w="1418"/>
+        <w:gridCol w:w="5103"/>
+      </w:tblGrid>
+      <w:tr>
+        <w:trPr>
+          <w:tblHeader/>
+        </w:trPr>
+        <w:tc>
+          <w:tcPr>
+            <w:tcW w:w="1696" w:type="dxa"/>
+            <w:noWrap/>
+            <w:vAlign w:val="center"/>
+            <w:hideMark/>
+          </w:tcPr>
+          <w:p>
+            <w:pPr>
+              <w:spacing w:line="240" w:lineRule="auto"/>
+              <w:ind w:firstLine="0"/>
+              <w:jc w:val="center"/>
+              <w:rPr>
+                <w:sz w:val="22"/>
+              </w:rPr>
+            </w:pPr>
+            <w:r>
+              <w:rPr>
+                <w:sz w:val="22"/>
+              </w:rPr>
+              <w:t>Название</w:t>
+            </w:r>
+          </w:p>
+        </w:tc>
+        <w:tc>
+          <w:tcPr>
+            <w:tcW w:w="1134" w:type="dxa"/>
+            <w:noWrap/>
+            <w:vAlign w:val="center"/>
+            <w:hideMark/>
+          </w:tcPr>
+          <w:p>
+            <w:pPr>
+              <w:spacing w:line="240" w:lineRule="auto"/>
+              <w:ind w:firstLine="0"/>
+              <w:jc w:val="center"/>
+              <w:rPr>
+                <w:sz w:val="22"/>
+              </w:rPr>
+            </w:pPr>
+            <w:r>
+              <w:rPr>
+                <w:sz w:val="22"/>
+              </w:rPr>
+              <w:t>Входные параметры</w:t>
+            </w:r>
+          </w:p>
+        </w:tc>
+        <w:tc>
+          <w:tcPr>
+            <w:tcW w:w="1418" w:type="dxa"/>
+            <w:noWrap/>
+            <w:vAlign w:val="center"/>
+            <w:hideMark/>
+          </w:tcPr>
+          <w:p>
+            <w:pPr>
+              <w:spacing w:line="240" w:lineRule="auto"/>
+              <w:ind w:firstLine="0"/>
+              <w:jc w:val="center"/>
+              <w:rPr>
+                <w:sz w:val="22"/>
+              </w:rPr>
+            </w:pPr>
+            <w:r>
+              <w:rPr>
+                <w:sz w:val="22"/>
+              </w:rPr>
+              <w:t>Тип возвращаемых данных</w:t>
+            </w:r>
+          </w:p>
+        </w:tc>
+        <w:tc>
+          <w:tcPr>
+            <w:tcW w:w="5103" w:type="dxa"/>
+            <w:noWrap/>
+            <w:vAlign w:val="center"/>
+            <w:hideMark/>
+          </w:tcPr>
+          <w:p>
+            <w:pPr>
+              <w:spacing w:line="240" w:lineRule="auto"/>
+              <w:ind w:firstLine="0"/>
+              <w:jc w:val="center"/>
+              <w:rPr>
+                <w:sz w:val="22"/>
+              </w:rPr>
+            </w:pPr>
+            <w:r>
+              <w:rPr>
+                <w:sz w:val="22"/>
+              </w:rPr>
+              <w:t>Описание</w:t>
+            </w:r>
+          </w:p>
+        </w:tc>
+      </w:tr>
+      <w:tr>
+        <w:tc>
+          <w:tcPr>
+            <w:tcW w:w="1696" w:type="dxa"/>
+            <w:vAlign w:val="bottom"/>
+            <w:hideMark/>
+          </w:tcPr>
+          <w:p>
+            <w:pPr>
+              <w:spacing w:line="240" w:lineRule="auto"/>
+              <w:ind w:firstLine="0"/>
+              <w:rPr>
+                <w:sz w:val="22"/>
+              </w:rPr>
+            </w:pPr>
+            <w:r>
+              <w:rPr>
+                <w:sz w:val="22"/>
+              </w:rPr>
+              <w:t>StartTransaction</w:t>
+            </w:r>
+          </w:p>
+        </w:tc>
+        <w:tc>
+          <w:tcPr>
+            <w:tcW w:w="1134" w:type="dxa"/>
+            <w:vAlign w:val="bottom"/>
+            <w:hideMark/>
+          </w:tcPr>
+          <w:p>
+            <w:pPr>
+              <w:spacing w:line="240" w:lineRule="auto"/>
+              <w:ind w:firstLine="0"/>
+              <w:rPr>
+                <w:sz w:val="22"/>
+              </w:rPr>
+            </w:pPr>
+            <w:r>
+              <w:rPr>
+                <w:sz w:val="22"/>
+              </w:rPr>
+              <w:t>—</w:t>
+            </w:r>
+          </w:p>
+        </w:tc>
+        <w:tc>
+          <w:tcPr>
+            <w:tcW w:w="1418" w:type="dxa"/>
+            <w:vAlign w:val="bottom"/>
+            <w:hideMark/>
+          </w:tcPr>
+          <w:p>
+            <w:pPr>
+              <w:spacing w:line="240" w:lineRule="auto"/>
+              <w:ind w:firstLine="0"/>
+              <w:rPr>
+                <w:sz w:val="22"/>
+              </w:rPr>
+            </w:pPr>
+            <w:r>
+              <w:rPr>
+                <w:sz w:val="22"/>
+              </w:rPr>
+              <w:t>Transaction</w:t>
+            </w:r>
+          </w:p>
+        </w:tc>
+        <w:tc>
+          <w:tcPr>
+            <w:tcW w:w="5103" w:type="dxa"/>
+            <w:vAlign w:val="bottom"/>
+            <w:hideMark/>
+          </w:tcPr>
+          <w:p>
+            <w:pPr>
+              <w:spacing w:line="240" w:lineRule="auto"/>
+              <w:ind w:firstLine="0"/>
+              <w:rPr>
+                <w:sz w:val="22"/>
+              </w:rPr>
+            </w:pPr>
+            <w:r>
+              <w:rPr>
+                <w:sz w:val="22"/>
+              </w:rPr>
+              <w:t>Запускает новую транзакцию для работы с БД чертежа</w:t>
+            </w:r>
+          </w:p>
+        </w:tc>
+      </w:tr>
+      <w:tr>
+        <w:tc>
+          <w:tcPr>
+            <w:tcW w:w="1696" w:type="dxa"/>
+            <w:vAlign w:val="bottom"/>
+            <w:hideMark/>
+          </w:tcPr>
+          <w:p>
+            <w:pPr>
+              <w:spacing w:line="240" w:lineRule="auto"/>
+              <w:ind w:firstLine="0"/>
+              <w:rPr>
+                <w:sz w:val="22"/>
+              </w:rPr>
+            </w:pPr>
+            <w:r>
+              <w:rPr>
+                <w:sz w:val="22"/>
+              </w:rPr>
+              <w:t>StartOpenCloseTransaction</w:t>
+            </w:r>
+          </w:p>
+        </w:tc>
+        <w:tc>
+          <w:tcPr>
+            <w:tcW w:w="1134" w:type="dxa"/>
+            <w:vAlign w:val="bottom"/>
+            <w:hideMark/>
+          </w:tcPr>
+          <w:p>
+            <w:pPr>
+              <w:spacing w:line="240" w:lineRule="auto"/>
+              <w:ind w:firstLine="0"/>
+              <w:rPr>
+                <w:sz w:val="22"/>
+              </w:rPr>
+            </w:pPr>
+            <w:r>
+              <w:rPr>
+                <w:sz w:val="22"/>
+              </w:rPr>
+              <w:t>—</w:t>
+            </w:r>
+          </w:p>
+        </w:tc>
+        <w:tc>
+          <w:tcPr>
+            <w:tcW w:w="1418" w:type="dxa"/>
+            <w:vAlign w:val="bottom"/>
+            <w:hideMark/>
+          </w:tcPr>
+          <w:p>
+            <w:pPr>
+              <w:spacing w:line="240" w:lineRule="auto"/>
+              <w:ind w:firstLine="0"/>
+              <w:rPr>
+                <w:sz w:val="22"/>
+              </w:rPr>
+            </w:pPr>
+            <w:r>
+              <w:rPr>
+                <w:sz w:val="22"/>
+              </w:rPr>
+              <w:t>OpenCloseTransaction</w:t>
+            </w:r>
+          </w:p>
+        </w:tc>
+        <w:tc>
+          <w:tcPr>
+            <w:tcW w:w="5103" w:type="dxa"/>
+            <w:vAlign w:val="bottom"/>
+            <w:hideMark/>
+          </w:tcPr>
+          <w:p>
+            <w:pPr>
+              <w:spacing w:line="240" w:lineRule="auto"/>
+              <w:ind w:firstLine="0"/>
+              <w:rPr>
+                <w:sz w:val="22"/>
+              </w:rPr>
+            </w:pPr>
+            <w:r>
+              <w:rPr>
+                <w:sz w:val="22"/>
+              </w:rPr>
+              <w:t>Запускает транзакцию типа open/close (используется в отдельных сценариях работы с БД)</w:t>
+            </w:r>
+          </w:p>
+        </w:tc>
+      </w:tr>
+    </w:tbl>
+    <w:p/>
+    <w:p>
+      <w:pPr>
+        <w:ind w:firstLine="0"/>
+      </w:pPr>
+      <w:r>
+        <w:t xml:space="preserve">Таблица </w:t>
+      </w:r>
+      <w:r>
+        <w:t>1</w:t>
+      </w:r>
+      <w:r>
+        <w:t>.6 — Используемые методы класса BlockTableRecord</w:t>
+      </w:r>
+    </w:p>
+    <w:tbl>
+      <w:tblPr>
+        <w:tblW w:w="9351" w:type="dxa"/>
+        <w:tblBorders>
+          <w:top w:val="single" w:sz="4" w:space="0" w:color="auto"/>
+          <w:left w:val="single" w:sz="4" w:space="0" w:color="auto"/>
+          <w:bottom w:val="single" w:sz="4" w:space="0" w:color="auto"/>
+          <w:right w:val="single" w:sz="4" w:space="0" w:color="auto"/>
+          <w:insideH w:val="single" w:sz="4" w:space="0" w:color="auto"/>
+          <w:insideV w:val="single" w:sz="4" w:space="0" w:color="auto"/>
+        </w:tblBorders>
+        <w:tblCellMar>
+          <w:top w:w="15" w:type="dxa"/>
+          <w:left w:w="15" w:type="dxa"/>
+          <w:bottom w:w="15" w:type="dxa"/>
+          <w:right w:w="15" w:type="dxa"/>
+        </w:tblCellMar>
+        <w:tblLook w:val="04A0" w:firstRow="1" w:lastRow="0" w:firstColumn="1" w:lastColumn="0" w:noHBand="0" w:noVBand="1"/>
+      </w:tblPr>
+      <w:tblGrid>
+        <w:gridCol w:w="1555"/>
+        <w:gridCol w:w="1275"/>
+        <w:gridCol w:w="1418"/>
+        <w:gridCol w:w="5103"/>
+      </w:tblGrid>
+      <w:tr>
+        <w:trPr>
+          <w:tblHeader/>
+        </w:trPr>
+        <w:tc>
+          <w:tcPr>
+            <w:tcW w:w="1555" w:type="dxa"/>
+            <w:noWrap/>
+            <w:vAlign w:val="center"/>
+            <w:hideMark/>
+          </w:tcPr>
+          <w:p>
+            <w:pPr>
+              <w:spacing w:line="240" w:lineRule="auto"/>
+              <w:ind w:firstLine="0"/>
+              <w:jc w:val="center"/>
+              <w:rPr>
+                <w:sz w:val="22"/>
+              </w:rPr>
+            </w:pPr>
+            <w:r>
+              <w:rPr>
+                <w:sz w:val="22"/>
+              </w:rPr>
+              <w:t>Название</w:t>
+            </w:r>
+          </w:p>
+        </w:tc>
+        <w:tc>
+          <w:tcPr>
+            <w:tcW w:w="1275" w:type="dxa"/>
+            <w:noWrap/>
+            <w:vAlign w:val="center"/>
+            <w:hideMark/>
+          </w:tcPr>
+          <w:p>
+            <w:pPr>
+              <w:spacing w:line="240" w:lineRule="auto"/>
+              <w:ind w:firstLine="0"/>
+              <w:jc w:val="center"/>
+              <w:rPr>
+                <w:sz w:val="22"/>
+              </w:rPr>
+            </w:pPr>
+            <w:r>
+              <w:rPr>
+                <w:sz w:val="22"/>
+              </w:rPr>
+              <w:t>Входные параметры</w:t>
+            </w:r>
+          </w:p>
+        </w:tc>
+        <w:tc>
+          <w:tcPr>
+            <w:tcW w:w="1418" w:type="dxa"/>
+            <w:noWrap/>
+            <w:vAlign w:val="center"/>
+            <w:hideMark/>
+          </w:tcPr>
+          <w:p>
+            <w:pPr>
+              <w:spacing w:line="240" w:lineRule="auto"/>
+              <w:ind w:firstLine="0"/>
+              <w:jc w:val="center"/>
+              <w:rPr>
+                <w:sz w:val="22"/>
+              </w:rPr>
+            </w:pPr>
+            <w:r>
+              <w:rPr>
+                <w:sz w:val="22"/>
+              </w:rPr>
+              <w:t>Тип возвращаемых данных</w:t>
+            </w:r>
+          </w:p>
+        </w:tc>
+        <w:tc>
+          <w:tcPr>
+            <w:tcW w:w="5103" w:type="dxa"/>
+            <w:noWrap/>
+            <w:vAlign w:val="center"/>
+            <w:hideMark/>
+          </w:tcPr>
+          <w:p>
+            <w:pPr>
+              <w:spacing w:line="240" w:lineRule="auto"/>
+              <w:ind w:firstLine="0"/>
+              <w:jc w:val="center"/>
+              <w:rPr>
+                <w:sz w:val="22"/>
+              </w:rPr>
+            </w:pPr>
+            <w:r>
+              <w:rPr>
+                <w:sz w:val="22"/>
+              </w:rPr>
+              <w:t>Описание</w:t>
+            </w:r>
+          </w:p>
+        </w:tc>
+      </w:tr>
+      <w:tr>
+        <w:tc>
+          <w:tcPr>
+            <w:tcW w:w="1555" w:type="dxa"/>
+            <w:vAlign w:val="bottom"/>
+            <w:hideMark/>
+          </w:tcPr>
+          <w:p>
+            <w:pPr>
+              <w:spacing w:line="240" w:lineRule="auto"/>
+              <w:ind w:firstLine="0"/>
+              <w:rPr>
+                <w:sz w:val="22"/>
+              </w:rPr>
+            </w:pPr>
+            <w:r>
+              <w:rPr>
+                <w:sz w:val="22"/>
+              </w:rPr>
+              <w:t>AppendEntity</w:t>
+            </w:r>
+          </w:p>
+        </w:tc>
+        <w:tc>
+          <w:tcPr>
+            <w:tcW w:w="1275" w:type="dxa"/>
+            <w:vAlign w:val="bottom"/>
+            <w:hideMark/>
+          </w:tcPr>
+          <w:p>
+            <w:pPr>
+              <w:spacing w:line="240" w:lineRule="auto"/>
+              <w:ind w:firstLine="0"/>
+              <w:rPr>
+                <w:sz w:val="22"/>
+              </w:rPr>
+            </w:pPr>
+            <w:r>
+              <w:rPr>
+                <w:sz w:val="22"/>
+              </w:rPr>
+              <w:t>Entity entity</w:t>
+            </w:r>
+          </w:p>
+        </w:tc>
+        <w:tc>
+          <w:tcPr>
+            <w:tcW w:w="1418" w:type="dxa"/>
+            <w:vAlign w:val="bottom"/>
+            <w:hideMark/>
+          </w:tcPr>
+          <w:p>
+            <w:pPr>
+              <w:spacing w:line="240" w:lineRule="auto"/>
+              <w:ind w:firstLine="0"/>
+              <w:rPr>
+                <w:sz w:val="22"/>
+              </w:rPr>
+            </w:pPr>
+            <w:r>
+              <w:rPr>
+                <w:sz w:val="22"/>
+              </w:rPr>
+              <w:t>ObjectId</w:t>
+            </w:r>
+          </w:p>
+        </w:tc>
+        <w:tc>
+          <w:tcPr>
+            <w:tcW w:w="5103" w:type="dxa"/>
+            <w:vAlign w:val="bottom"/>
+            <w:hideMark/>
+          </w:tcPr>
+          <w:p>
+            <w:pPr>
+              <w:spacing w:line="240" w:lineRule="auto"/>
+              <w:ind w:firstLine="0"/>
+              <w:rPr>
+                <w:sz w:val="22"/>
+              </w:rPr>
+            </w:pPr>
+            <w:r>
+              <w:rPr>
+                <w:sz w:val="22"/>
+              </w:rPr>
+              <w:t>Добавляет примитив (сущность) в блок/пространство чертежа и возвращает его идентификатор</w:t>
+            </w:r>
+          </w:p>
+        </w:tc>
+      </w:tr>
+    </w:tbl>
+    <w:p/>
     <w:p>
       <w:pPr>
         <w:pStyle w:val="Heading2"/>
       </w:pPr>
       <w:r>
-        <w:rPr>
-          <w:lang w:val="en-US"/>
-        </w:rPr>
         <w:t xml:space="preserve">1.3 </w:t>
       </w:r>
       <w:r>
         <w:t>Обзор аналогов плагина</w:t>
       </w:r>
     </w:p>
-    <w:p>
-      <w:pPr>
-        <w:rPr>
-          <w:lang w:val="en-US"/>
-        </w:rPr>
-      </w:pPr>
-    </w:p>
+    <w:p/>
     <w:p/>
     <w:p/>
     <w:p>
@@ -1006,6 +3567,304 @@
 <file path=word/numbering.xml><?xml version="1.0" encoding="utf-8"?>
 <w:numbering xmlns:wpc="http://schemas.microsoft.com/office/word/2010/wordprocessingCanvas" xmlns:cx="http://schemas.microsoft.com/office/drawing/2014/chartex" xmlns:cx1="http://schemas.microsoft.com/office/drawing/2015/9/8/chartex" xmlns:cx2="http://schemas.microsoft.com/office/drawing/2015/10/21/chartex" xmlns:cx3="http://schemas.microsoft.com/office/drawing/2016/5/9/chartex" xmlns:cx4="http://schemas.microsoft.com/office/drawing/2016/5/10/chartex" xmlns:cx5="http://schemas.microsoft.com/office/drawing/2016/5/11/chartex" xmlns:cx6="http://schemas.microsoft.com/office/drawing/2016/5/12/chartex" xmlns:cx7="http://schemas.microsoft.com/office/drawing/2016/5/13/chartex" xmlns:cx8="http://schemas.microsoft.com/office/drawing/2016/5/14/chartex" xmlns:mc="http://schemas.openxmlformats.org/markup-compatibility/2006" xmlns:aink="http://schemas.microsoft.com/office/drawing/2016/ink" xmlns:am3d="http://schemas.microsoft.com/office/drawing/2017/model3d" xmlns:o="urn:schemas-microsoft-com:office:office" xmlns:oel="http://schemas.microsoft.com/office/2019/extlst" xmlns:r="http://schemas.openxmlformats.org/officeDocument/2006/relationships" xmlns:m="http://schemas.openxmlformats.org/officeDocument/2006/math" xmlns:v="urn:schemas-microsoft-com:vml" xmlns:wp14="http://schemas.microsoft.com/office/word/2010/wordprocessingDrawing" xmlns:wp="http://schemas.openxmlformats.org/drawingml/2006/wordprocessingDrawing" xmlns:w10="urn:schemas-microsoft-com:office:word" xmlns:w="http://schemas.openxmlformats.org/wordprocessingml/2006/main" xmlns:w14="http://schemas.microsoft.com/office/word/2010/wordml" xmlns:w15="http://schemas.microsoft.com/office/word/2012/wordml" xmlns:w16cex="http://schemas.microsoft.com/office/word/2018/wordml/cex" xmlns:w16cid="http://schemas.microsoft.com/office/word/2016/wordml/cid" xmlns:w16="http://schemas.microsoft.com/office/word/2018/wordml" xmlns:w16du="http://schemas.microsoft.com/office/word/2023/wordml/word16du" xmlns:w16sdtdh="http://schemas.microsoft.com/office/word/2020/wordml/sdtdatahash" xmlns:w16sdtfl="http://schemas.microsoft.com/office/word/2024/wordml/sdtformatlock" xmlns:w16se="http://schemas.microsoft.com/office/word/2015/wordml/symex" xmlns:wpg="http://schemas.microsoft.com/office/word/2010/wordprocessingGroup" xmlns:wpi="http://schemas.microsoft.com/office/word/2010/wordprocessingInk" xmlns:wne="http://schemas.microsoft.com/office/word/2006/wordml" xmlns:wps="http://schemas.microsoft.com/office/word/2010/wordprocessingShape" mc:Ignorable="w14 w15 w16se w16cid w16 w16cex w16sdtdh w16sdtfl w16du wp14">
   <w:abstractNum w:abstractNumId="0" w15:restartNumberingAfterBreak="0">
+    <w:nsid w:val="11ED5D7B"/>
+    <w:multiLevelType w:val="multilevel"/>
+    <w:tmpl w:val="1ACC8590"/>
+    <w:lvl w:ilvl="0">
+      <w:start w:val="1"/>
+      <w:numFmt w:val="bullet"/>
+      <w:lvlText w:val=""/>
+      <w:lvlJc w:val="left"/>
+      <w:pPr>
+        <w:tabs>
+          <w:tab w:val="num" w:pos="720"/>
+        </w:tabs>
+        <w:ind w:left="720" w:hanging="360"/>
+      </w:pPr>
+      <w:rPr>
+        <w:rFonts w:ascii="Symbol" w:hAnsi="Symbol" w:hint="default"/>
+        <w:sz w:val="20"/>
+      </w:rPr>
+    </w:lvl>
+    <w:lvl w:ilvl="1" w:tentative="1">
+      <w:start w:val="1"/>
+      <w:numFmt w:val="bullet"/>
+      <w:lvlText w:val=""/>
+      <w:lvlJc w:val="left"/>
+      <w:pPr>
+        <w:tabs>
+          <w:tab w:val="num" w:pos="1440"/>
+        </w:tabs>
+        <w:ind w:left="1440" w:hanging="360"/>
+      </w:pPr>
+      <w:rPr>
+        <w:rFonts w:ascii="Symbol" w:hAnsi="Symbol" w:hint="default"/>
+        <w:sz w:val="20"/>
+      </w:rPr>
+    </w:lvl>
+    <w:lvl w:ilvl="2" w:tentative="1">
+      <w:start w:val="1"/>
+      <w:numFmt w:val="bullet"/>
+      <w:lvlText w:val=""/>
+      <w:lvlJc w:val="left"/>
+      <w:pPr>
+        <w:tabs>
+          <w:tab w:val="num" w:pos="2160"/>
+        </w:tabs>
+        <w:ind w:left="2160" w:hanging="360"/>
+      </w:pPr>
+      <w:rPr>
+        <w:rFonts w:ascii="Symbol" w:hAnsi="Symbol" w:hint="default"/>
+        <w:sz w:val="20"/>
+      </w:rPr>
+    </w:lvl>
+    <w:lvl w:ilvl="3" w:tentative="1">
+      <w:start w:val="1"/>
+      <w:numFmt w:val="bullet"/>
+      <w:lvlText w:val=""/>
+      <w:lvlJc w:val="left"/>
+      <w:pPr>
+        <w:tabs>
+          <w:tab w:val="num" w:pos="2880"/>
+        </w:tabs>
+        <w:ind w:left="2880" w:hanging="360"/>
+      </w:pPr>
+      <w:rPr>
+        <w:rFonts w:ascii="Symbol" w:hAnsi="Symbol" w:hint="default"/>
+        <w:sz w:val="20"/>
+      </w:rPr>
+    </w:lvl>
+    <w:lvl w:ilvl="4" w:tentative="1">
+      <w:start w:val="1"/>
+      <w:numFmt w:val="bullet"/>
+      <w:lvlText w:val=""/>
+      <w:lvlJc w:val="left"/>
+      <w:pPr>
+        <w:tabs>
+          <w:tab w:val="num" w:pos="3600"/>
+        </w:tabs>
+        <w:ind w:left="3600" w:hanging="360"/>
+      </w:pPr>
+      <w:rPr>
+        <w:rFonts w:ascii="Symbol" w:hAnsi="Symbol" w:hint="default"/>
+        <w:sz w:val="20"/>
+      </w:rPr>
+    </w:lvl>
+    <w:lvl w:ilvl="5" w:tentative="1">
+      <w:start w:val="1"/>
+      <w:numFmt w:val="bullet"/>
+      <w:lvlText w:val=""/>
+      <w:lvlJc w:val="left"/>
+      <w:pPr>
+        <w:tabs>
+          <w:tab w:val="num" w:pos="4320"/>
+        </w:tabs>
+        <w:ind w:left="4320" w:hanging="360"/>
+      </w:pPr>
+      <w:rPr>
+        <w:rFonts w:ascii="Symbol" w:hAnsi="Symbol" w:hint="default"/>
+        <w:sz w:val="20"/>
+      </w:rPr>
+    </w:lvl>
+    <w:lvl w:ilvl="6" w:tentative="1">
+      <w:start w:val="1"/>
+      <w:numFmt w:val="bullet"/>
+      <w:lvlText w:val=""/>
+      <w:lvlJc w:val="left"/>
+      <w:pPr>
+        <w:tabs>
+          <w:tab w:val="num" w:pos="5040"/>
+        </w:tabs>
+        <w:ind w:left="5040" w:hanging="360"/>
+      </w:pPr>
+      <w:rPr>
+        <w:rFonts w:ascii="Symbol" w:hAnsi="Symbol" w:hint="default"/>
+        <w:sz w:val="20"/>
+      </w:rPr>
+    </w:lvl>
+    <w:lvl w:ilvl="7" w:tentative="1">
+      <w:start w:val="1"/>
+      <w:numFmt w:val="bullet"/>
+      <w:lvlText w:val=""/>
+      <w:lvlJc w:val="left"/>
+      <w:pPr>
+        <w:tabs>
+          <w:tab w:val="num" w:pos="5760"/>
+        </w:tabs>
+        <w:ind w:left="5760" w:hanging="360"/>
+      </w:pPr>
+      <w:rPr>
+        <w:rFonts w:ascii="Symbol" w:hAnsi="Symbol" w:hint="default"/>
+        <w:sz w:val="20"/>
+      </w:rPr>
+    </w:lvl>
+    <w:lvl w:ilvl="8" w:tentative="1">
+      <w:start w:val="1"/>
+      <w:numFmt w:val="bullet"/>
+      <w:lvlText w:val=""/>
+      <w:lvlJc w:val="left"/>
+      <w:pPr>
+        <w:tabs>
+          <w:tab w:val="num" w:pos="6480"/>
+        </w:tabs>
+        <w:ind w:left="6480" w:hanging="360"/>
+      </w:pPr>
+      <w:rPr>
+        <w:rFonts w:ascii="Symbol" w:hAnsi="Symbol" w:hint="default"/>
+        <w:sz w:val="20"/>
+      </w:rPr>
+    </w:lvl>
+  </w:abstractNum>
+  <w:abstractNum w:abstractNumId="1" w15:restartNumberingAfterBreak="0">
+    <w:nsid w:val="139E3DCE"/>
+    <w:multiLevelType w:val="multilevel"/>
+    <w:tmpl w:val="A634A80A"/>
+    <w:lvl w:ilvl="0">
+      <w:start w:val="1"/>
+      <w:numFmt w:val="bullet"/>
+      <w:lvlText w:val=""/>
+      <w:lvlJc w:val="left"/>
+      <w:pPr>
+        <w:tabs>
+          <w:tab w:val="num" w:pos="720"/>
+        </w:tabs>
+        <w:ind w:left="720" w:hanging="360"/>
+      </w:pPr>
+      <w:rPr>
+        <w:rFonts w:ascii="Symbol" w:hAnsi="Symbol" w:hint="default"/>
+        <w:sz w:val="20"/>
+      </w:rPr>
+    </w:lvl>
+    <w:lvl w:ilvl="1" w:tentative="1">
+      <w:start w:val="1"/>
+      <w:numFmt w:val="bullet"/>
+      <w:lvlText w:val=""/>
+      <w:lvlJc w:val="left"/>
+      <w:pPr>
+        <w:tabs>
+          <w:tab w:val="num" w:pos="1440"/>
+        </w:tabs>
+        <w:ind w:left="1440" w:hanging="360"/>
+      </w:pPr>
+      <w:rPr>
+        <w:rFonts w:ascii="Symbol" w:hAnsi="Symbol" w:hint="default"/>
+        <w:sz w:val="20"/>
+      </w:rPr>
+    </w:lvl>
+    <w:lvl w:ilvl="2" w:tentative="1">
+      <w:start w:val="1"/>
+      <w:numFmt w:val="bullet"/>
+      <w:lvlText w:val=""/>
+      <w:lvlJc w:val="left"/>
+      <w:pPr>
+        <w:tabs>
+          <w:tab w:val="num" w:pos="2160"/>
+        </w:tabs>
+        <w:ind w:left="2160" w:hanging="360"/>
+      </w:pPr>
+      <w:rPr>
+        <w:rFonts w:ascii="Symbol" w:hAnsi="Symbol" w:hint="default"/>
+        <w:sz w:val="20"/>
+      </w:rPr>
+    </w:lvl>
+    <w:lvl w:ilvl="3" w:tentative="1">
+      <w:start w:val="1"/>
+      <w:numFmt w:val="bullet"/>
+      <w:lvlText w:val=""/>
+      <w:lvlJc w:val="left"/>
+      <w:pPr>
+        <w:tabs>
+          <w:tab w:val="num" w:pos="2880"/>
+        </w:tabs>
+        <w:ind w:left="2880" w:hanging="360"/>
+      </w:pPr>
+      <w:rPr>
+        <w:rFonts w:ascii="Symbol" w:hAnsi="Symbol" w:hint="default"/>
+        <w:sz w:val="20"/>
+      </w:rPr>
+    </w:lvl>
+    <w:lvl w:ilvl="4" w:tentative="1">
+      <w:start w:val="1"/>
+      <w:numFmt w:val="bullet"/>
+      <w:lvlText w:val=""/>
+      <w:lvlJc w:val="left"/>
+      <w:pPr>
+        <w:tabs>
+          <w:tab w:val="num" w:pos="3600"/>
+        </w:tabs>
+        <w:ind w:left="3600" w:hanging="360"/>
+      </w:pPr>
+      <w:rPr>
+        <w:rFonts w:ascii="Symbol" w:hAnsi="Symbol" w:hint="default"/>
+        <w:sz w:val="20"/>
+      </w:rPr>
+    </w:lvl>
+    <w:lvl w:ilvl="5" w:tentative="1">
+      <w:start w:val="1"/>
+      <w:numFmt w:val="bullet"/>
+      <w:lvlText w:val=""/>
+      <w:lvlJc w:val="left"/>
+      <w:pPr>
+        <w:tabs>
+          <w:tab w:val="num" w:pos="4320"/>
+        </w:tabs>
+        <w:ind w:left="4320" w:hanging="360"/>
+      </w:pPr>
+      <w:rPr>
+        <w:rFonts w:ascii="Symbol" w:hAnsi="Symbol" w:hint="default"/>
+        <w:sz w:val="20"/>
+      </w:rPr>
+    </w:lvl>
+    <w:lvl w:ilvl="6" w:tentative="1">
+      <w:start w:val="1"/>
+      <w:numFmt w:val="bullet"/>
+      <w:lvlText w:val=""/>
+      <w:lvlJc w:val="left"/>
+      <w:pPr>
+        <w:tabs>
+          <w:tab w:val="num" w:pos="5040"/>
+        </w:tabs>
+        <w:ind w:left="5040" w:hanging="360"/>
+      </w:pPr>
+      <w:rPr>
+        <w:rFonts w:ascii="Symbol" w:hAnsi="Symbol" w:hint="default"/>
+        <w:sz w:val="20"/>
+      </w:rPr>
+    </w:lvl>
+    <w:lvl w:ilvl="7" w:tentative="1">
+      <w:start w:val="1"/>
+      <w:numFmt w:val="bullet"/>
+      <w:lvlText w:val=""/>
+      <w:lvlJc w:val="left"/>
+      <w:pPr>
+        <w:tabs>
+          <w:tab w:val="num" w:pos="5760"/>
+        </w:tabs>
+        <w:ind w:left="5760" w:hanging="360"/>
+      </w:pPr>
+      <w:rPr>
+        <w:rFonts w:ascii="Symbol" w:hAnsi="Symbol" w:hint="default"/>
+        <w:sz w:val="20"/>
+      </w:rPr>
+    </w:lvl>
+    <w:lvl w:ilvl="8" w:tentative="1">
+      <w:start w:val="1"/>
+      <w:numFmt w:val="bullet"/>
+      <w:lvlText w:val=""/>
+      <w:lvlJc w:val="left"/>
+      <w:pPr>
+        <w:tabs>
+          <w:tab w:val="num" w:pos="6480"/>
+        </w:tabs>
+        <w:ind w:left="6480" w:hanging="360"/>
+      </w:pPr>
+      <w:rPr>
+        <w:rFonts w:ascii="Symbol" w:hAnsi="Symbol" w:hint="default"/>
+        <w:sz w:val="20"/>
+      </w:rPr>
+    </w:lvl>
+  </w:abstractNum>
+  <w:abstractNum w:abstractNumId="2" w15:restartNumberingAfterBreak="0">
     <w:nsid w:val="26792F94"/>
     <w:multiLevelType w:val="multilevel"/>
     <w:tmpl w:val="0122EA10"/>
@@ -1118,8 +3977,398 @@
       </w:rPr>
     </w:lvl>
   </w:abstractNum>
+  <w:abstractNum w:abstractNumId="3" w15:restartNumberingAfterBreak="0">
+    <w:nsid w:val="3762619B"/>
+    <w:multiLevelType w:val="multilevel"/>
+    <w:tmpl w:val="787ED6AC"/>
+    <w:lvl w:ilvl="0">
+      <w:start w:val="1"/>
+      <w:numFmt w:val="decimal"/>
+      <w:lvlText w:val="%1."/>
+      <w:lvlJc w:val="left"/>
+      <w:pPr>
+        <w:tabs>
+          <w:tab w:val="num" w:pos="720"/>
+        </w:tabs>
+        <w:ind w:left="720" w:hanging="360"/>
+      </w:pPr>
+    </w:lvl>
+    <w:lvl w:ilvl="1" w:tentative="1">
+      <w:start w:val="1"/>
+      <w:numFmt w:val="decimal"/>
+      <w:lvlText w:val="%2."/>
+      <w:lvlJc w:val="left"/>
+      <w:pPr>
+        <w:tabs>
+          <w:tab w:val="num" w:pos="1440"/>
+        </w:tabs>
+        <w:ind w:left="1440" w:hanging="360"/>
+      </w:pPr>
+    </w:lvl>
+    <w:lvl w:ilvl="2" w:tentative="1">
+      <w:start w:val="1"/>
+      <w:numFmt w:val="decimal"/>
+      <w:lvlText w:val="%3."/>
+      <w:lvlJc w:val="left"/>
+      <w:pPr>
+        <w:tabs>
+          <w:tab w:val="num" w:pos="2160"/>
+        </w:tabs>
+        <w:ind w:left="2160" w:hanging="360"/>
+      </w:pPr>
+    </w:lvl>
+    <w:lvl w:ilvl="3" w:tentative="1">
+      <w:start w:val="1"/>
+      <w:numFmt w:val="decimal"/>
+      <w:lvlText w:val="%4."/>
+      <w:lvlJc w:val="left"/>
+      <w:pPr>
+        <w:tabs>
+          <w:tab w:val="num" w:pos="2880"/>
+        </w:tabs>
+        <w:ind w:left="2880" w:hanging="360"/>
+      </w:pPr>
+    </w:lvl>
+    <w:lvl w:ilvl="4" w:tentative="1">
+      <w:start w:val="1"/>
+      <w:numFmt w:val="decimal"/>
+      <w:lvlText w:val="%5."/>
+      <w:lvlJc w:val="left"/>
+      <w:pPr>
+        <w:tabs>
+          <w:tab w:val="num" w:pos="3600"/>
+        </w:tabs>
+        <w:ind w:left="3600" w:hanging="360"/>
+      </w:pPr>
+    </w:lvl>
+    <w:lvl w:ilvl="5" w:tentative="1">
+      <w:start w:val="1"/>
+      <w:numFmt w:val="decimal"/>
+      <w:lvlText w:val="%6."/>
+      <w:lvlJc w:val="left"/>
+      <w:pPr>
+        <w:tabs>
+          <w:tab w:val="num" w:pos="4320"/>
+        </w:tabs>
+        <w:ind w:left="4320" w:hanging="360"/>
+      </w:pPr>
+    </w:lvl>
+    <w:lvl w:ilvl="6" w:tentative="1">
+      <w:start w:val="1"/>
+      <w:numFmt w:val="decimal"/>
+      <w:lvlText w:val="%7."/>
+      <w:lvlJc w:val="left"/>
+      <w:pPr>
+        <w:tabs>
+          <w:tab w:val="num" w:pos="5040"/>
+        </w:tabs>
+        <w:ind w:left="5040" w:hanging="360"/>
+      </w:pPr>
+    </w:lvl>
+    <w:lvl w:ilvl="7" w:tentative="1">
+      <w:start w:val="1"/>
+      <w:numFmt w:val="decimal"/>
+      <w:lvlText w:val="%8."/>
+      <w:lvlJc w:val="left"/>
+      <w:pPr>
+        <w:tabs>
+          <w:tab w:val="num" w:pos="5760"/>
+        </w:tabs>
+        <w:ind w:left="5760" w:hanging="360"/>
+      </w:pPr>
+    </w:lvl>
+    <w:lvl w:ilvl="8" w:tentative="1">
+      <w:start w:val="1"/>
+      <w:numFmt w:val="decimal"/>
+      <w:lvlText w:val="%9."/>
+      <w:lvlJc w:val="left"/>
+      <w:pPr>
+        <w:tabs>
+          <w:tab w:val="num" w:pos="6480"/>
+        </w:tabs>
+        <w:ind w:left="6480" w:hanging="360"/>
+      </w:pPr>
+    </w:lvl>
+  </w:abstractNum>
+  <w:abstractNum w:abstractNumId="4" w15:restartNumberingAfterBreak="0">
+    <w:nsid w:val="4AFF6BDD"/>
+    <w:multiLevelType w:val="multilevel"/>
+    <w:tmpl w:val="7FEACD30"/>
+    <w:lvl w:ilvl="0">
+      <w:start w:val="1"/>
+      <w:numFmt w:val="bullet"/>
+      <w:lvlText w:val=""/>
+      <w:lvlJc w:val="left"/>
+      <w:pPr>
+        <w:tabs>
+          <w:tab w:val="num" w:pos="720"/>
+        </w:tabs>
+        <w:ind w:left="720" w:hanging="360"/>
+      </w:pPr>
+      <w:rPr>
+        <w:rFonts w:ascii="Symbol" w:hAnsi="Symbol" w:hint="default"/>
+        <w:sz w:val="20"/>
+      </w:rPr>
+    </w:lvl>
+    <w:lvl w:ilvl="1" w:tentative="1">
+      <w:start w:val="1"/>
+      <w:numFmt w:val="bullet"/>
+      <w:lvlText w:val=""/>
+      <w:lvlJc w:val="left"/>
+      <w:pPr>
+        <w:tabs>
+          <w:tab w:val="num" w:pos="1440"/>
+        </w:tabs>
+        <w:ind w:left="1440" w:hanging="360"/>
+      </w:pPr>
+      <w:rPr>
+        <w:rFonts w:ascii="Symbol" w:hAnsi="Symbol" w:hint="default"/>
+        <w:sz w:val="20"/>
+      </w:rPr>
+    </w:lvl>
+    <w:lvl w:ilvl="2" w:tentative="1">
+      <w:start w:val="1"/>
+      <w:numFmt w:val="bullet"/>
+      <w:lvlText w:val=""/>
+      <w:lvlJc w:val="left"/>
+      <w:pPr>
+        <w:tabs>
+          <w:tab w:val="num" w:pos="2160"/>
+        </w:tabs>
+        <w:ind w:left="2160" w:hanging="360"/>
+      </w:pPr>
+      <w:rPr>
+        <w:rFonts w:ascii="Symbol" w:hAnsi="Symbol" w:hint="default"/>
+        <w:sz w:val="20"/>
+      </w:rPr>
+    </w:lvl>
+    <w:lvl w:ilvl="3" w:tentative="1">
+      <w:start w:val="1"/>
+      <w:numFmt w:val="bullet"/>
+      <w:lvlText w:val=""/>
+      <w:lvlJc w:val="left"/>
+      <w:pPr>
+        <w:tabs>
+          <w:tab w:val="num" w:pos="2880"/>
+        </w:tabs>
+        <w:ind w:left="2880" w:hanging="360"/>
+      </w:pPr>
+      <w:rPr>
+        <w:rFonts w:ascii="Symbol" w:hAnsi="Symbol" w:hint="default"/>
+        <w:sz w:val="20"/>
+      </w:rPr>
+    </w:lvl>
+    <w:lvl w:ilvl="4" w:tentative="1">
+      <w:start w:val="1"/>
+      <w:numFmt w:val="bullet"/>
+      <w:lvlText w:val=""/>
+      <w:lvlJc w:val="left"/>
+      <w:pPr>
+        <w:tabs>
+          <w:tab w:val="num" w:pos="3600"/>
+        </w:tabs>
+        <w:ind w:left="3600" w:hanging="360"/>
+      </w:pPr>
+      <w:rPr>
+        <w:rFonts w:ascii="Symbol" w:hAnsi="Symbol" w:hint="default"/>
+        <w:sz w:val="20"/>
+      </w:rPr>
+    </w:lvl>
+    <w:lvl w:ilvl="5" w:tentative="1">
+      <w:start w:val="1"/>
+      <w:numFmt w:val="bullet"/>
+      <w:lvlText w:val=""/>
+      <w:lvlJc w:val="left"/>
+      <w:pPr>
+        <w:tabs>
+          <w:tab w:val="num" w:pos="4320"/>
+        </w:tabs>
+        <w:ind w:left="4320" w:hanging="360"/>
+      </w:pPr>
+      <w:rPr>
+        <w:rFonts w:ascii="Symbol" w:hAnsi="Symbol" w:hint="default"/>
+        <w:sz w:val="20"/>
+      </w:rPr>
+    </w:lvl>
+    <w:lvl w:ilvl="6" w:tentative="1">
+      <w:start w:val="1"/>
+      <w:numFmt w:val="bullet"/>
+      <w:lvlText w:val=""/>
+      <w:lvlJc w:val="left"/>
+      <w:pPr>
+        <w:tabs>
+          <w:tab w:val="num" w:pos="5040"/>
+        </w:tabs>
+        <w:ind w:left="5040" w:hanging="360"/>
+      </w:pPr>
+      <w:rPr>
+        <w:rFonts w:ascii="Symbol" w:hAnsi="Symbol" w:hint="default"/>
+        <w:sz w:val="20"/>
+      </w:rPr>
+    </w:lvl>
+    <w:lvl w:ilvl="7" w:tentative="1">
+      <w:start w:val="1"/>
+      <w:numFmt w:val="bullet"/>
+      <w:lvlText w:val=""/>
+      <w:lvlJc w:val="left"/>
+      <w:pPr>
+        <w:tabs>
+          <w:tab w:val="num" w:pos="5760"/>
+        </w:tabs>
+        <w:ind w:left="5760" w:hanging="360"/>
+      </w:pPr>
+      <w:rPr>
+        <w:rFonts w:ascii="Symbol" w:hAnsi="Symbol" w:hint="default"/>
+        <w:sz w:val="20"/>
+      </w:rPr>
+    </w:lvl>
+    <w:lvl w:ilvl="8" w:tentative="1">
+      <w:start w:val="1"/>
+      <w:numFmt w:val="bullet"/>
+      <w:lvlText w:val=""/>
+      <w:lvlJc w:val="left"/>
+      <w:pPr>
+        <w:tabs>
+          <w:tab w:val="num" w:pos="6480"/>
+        </w:tabs>
+        <w:ind w:left="6480" w:hanging="360"/>
+      </w:pPr>
+      <w:rPr>
+        <w:rFonts w:ascii="Symbol" w:hAnsi="Symbol" w:hint="default"/>
+        <w:sz w:val="20"/>
+      </w:rPr>
+    </w:lvl>
+  </w:abstractNum>
+  <w:abstractNum w:abstractNumId="5" w15:restartNumberingAfterBreak="0">
+    <w:nsid w:val="4F52304D"/>
+    <w:multiLevelType w:val="multilevel"/>
+    <w:tmpl w:val="5768C970"/>
+    <w:lvl w:ilvl="0">
+      <w:start w:val="1"/>
+      <w:numFmt w:val="decimal"/>
+      <w:lvlText w:val="%1."/>
+      <w:lvlJc w:val="left"/>
+      <w:pPr>
+        <w:tabs>
+          <w:tab w:val="num" w:pos="720"/>
+        </w:tabs>
+        <w:ind w:left="720" w:hanging="360"/>
+      </w:pPr>
+    </w:lvl>
+    <w:lvl w:ilvl="1" w:tentative="1">
+      <w:start w:val="1"/>
+      <w:numFmt w:val="decimal"/>
+      <w:lvlText w:val="%2."/>
+      <w:lvlJc w:val="left"/>
+      <w:pPr>
+        <w:tabs>
+          <w:tab w:val="num" w:pos="1440"/>
+        </w:tabs>
+        <w:ind w:left="1440" w:hanging="360"/>
+      </w:pPr>
+    </w:lvl>
+    <w:lvl w:ilvl="2" w:tentative="1">
+      <w:start w:val="1"/>
+      <w:numFmt w:val="decimal"/>
+      <w:lvlText w:val="%3."/>
+      <w:lvlJc w:val="left"/>
+      <w:pPr>
+        <w:tabs>
+          <w:tab w:val="num" w:pos="2160"/>
+        </w:tabs>
+        <w:ind w:left="2160" w:hanging="360"/>
+      </w:pPr>
+    </w:lvl>
+    <w:lvl w:ilvl="3" w:tentative="1">
+      <w:start w:val="1"/>
+      <w:numFmt w:val="decimal"/>
+      <w:lvlText w:val="%4."/>
+      <w:lvlJc w:val="left"/>
+      <w:pPr>
+        <w:tabs>
+          <w:tab w:val="num" w:pos="2880"/>
+        </w:tabs>
+        <w:ind w:left="2880" w:hanging="360"/>
+      </w:pPr>
+    </w:lvl>
+    <w:lvl w:ilvl="4" w:tentative="1">
+      <w:start w:val="1"/>
+      <w:numFmt w:val="decimal"/>
+      <w:lvlText w:val="%5."/>
+      <w:lvlJc w:val="left"/>
+      <w:pPr>
+        <w:tabs>
+          <w:tab w:val="num" w:pos="3600"/>
+        </w:tabs>
+        <w:ind w:left="3600" w:hanging="360"/>
+      </w:pPr>
+    </w:lvl>
+    <w:lvl w:ilvl="5" w:tentative="1">
+      <w:start w:val="1"/>
+      <w:numFmt w:val="decimal"/>
+      <w:lvlText w:val="%6."/>
+      <w:lvlJc w:val="left"/>
+      <w:pPr>
+        <w:tabs>
+          <w:tab w:val="num" w:pos="4320"/>
+        </w:tabs>
+        <w:ind w:left="4320" w:hanging="360"/>
+      </w:pPr>
+    </w:lvl>
+    <w:lvl w:ilvl="6" w:tentative="1">
+      <w:start w:val="1"/>
+      <w:numFmt w:val="decimal"/>
+      <w:lvlText w:val="%7."/>
+      <w:lvlJc w:val="left"/>
+      <w:pPr>
+        <w:tabs>
+          <w:tab w:val="num" w:pos="5040"/>
+        </w:tabs>
+        <w:ind w:left="5040" w:hanging="360"/>
+      </w:pPr>
+    </w:lvl>
+    <w:lvl w:ilvl="7" w:tentative="1">
+      <w:start w:val="1"/>
+      <w:numFmt w:val="decimal"/>
+      <w:lvlText w:val="%8."/>
+      <w:lvlJc w:val="left"/>
+      <w:pPr>
+        <w:tabs>
+          <w:tab w:val="num" w:pos="5760"/>
+        </w:tabs>
+        <w:ind w:left="5760" w:hanging="360"/>
+      </w:pPr>
+    </w:lvl>
+    <w:lvl w:ilvl="8" w:tentative="1">
+      <w:start w:val="1"/>
+      <w:numFmt w:val="decimal"/>
+      <w:lvlText w:val="%9."/>
+      <w:lvlJc w:val="left"/>
+      <w:pPr>
+        <w:tabs>
+          <w:tab w:val="num" w:pos="6480"/>
+        </w:tabs>
+        <w:ind w:left="6480" w:hanging="360"/>
+      </w:pPr>
+    </w:lvl>
+  </w:abstractNum>
   <w:num w:numId="1" w16cid:durableId="329410175">
+    <w:abstractNumId w:val="2"/>
+  </w:num>
+  <w:num w:numId="2" w16cid:durableId="103425428">
+    <w:abstractNumId w:val="1"/>
+  </w:num>
+  <w:num w:numId="3" w16cid:durableId="533467841">
+    <w:abstractNumId w:val="4"/>
+  </w:num>
+  <w:num w:numId="4" w16cid:durableId="394160421">
+    <w:abstractNumId w:val="3"/>
+  </w:num>
+  <w:num w:numId="5" w16cid:durableId="741607657">
     <w:abstractNumId w:val="0"/>
+  </w:num>
+  <w:num w:numId="6" w16cid:durableId="847134367">
+    <w:abstractNumId w:val="5"/>
   </w:num>
 </w:numbering>
 </file>

</xml_diff>

<commit_message>
fix tz.docx; update .gitignore for local test files
</commit_message>
<xml_diff>
--- a/docs/SystProj.docx
+++ b/docs/SystProj.docx
@@ -826,10 +826,7 @@
         <w:t>BricsCAD</w:t>
       </w:r>
       <w:r>
-        <w:t xml:space="preserve"> </w:t>
-      </w:r>
-      <w:r>
-        <w:t>–</w:t>
+        <w:t xml:space="preserve"> –</w:t>
       </w:r>
       <w:r>
         <w:t xml:space="preserve"> DWG</w:t>
@@ -859,10 +856,7 @@
         <w:t>FreeCAD</w:t>
       </w:r>
       <w:r>
-        <w:t xml:space="preserve"> </w:t>
-      </w:r>
-      <w:r>
-        <w:t>–</w:t>
+        <w:t xml:space="preserve"> –</w:t>
       </w:r>
       <w:r>
         <w:t xml:space="preserve"> параметрическая САПР, ориентированная на построение 3D</w:t>
@@ -1024,57 +1018,21 @@
         <w:rPr>
           <w:lang w:val="en-US"/>
         </w:rPr>
-        <w:t xml:space="preserve"> </w:t>
-      </w:r>
+        <w:t xml:space="preserve"> Class Library (C#), </w:t>
+      </w:r>
+      <w:proofErr w:type="spellStart"/>
       <w:r>
         <w:rPr>
           <w:lang w:val="en-US"/>
         </w:rPr>
-        <w:t>Class Library</w:t>
-      </w:r>
+        <w:t>TargetFramework</w:t>
+      </w:r>
+      <w:proofErr w:type="spellEnd"/>
       <w:r>
         <w:rPr>
           <w:lang w:val="en-US"/>
         </w:rPr>
-        <w:t xml:space="preserve"> </w:t>
-      </w:r>
-      <w:r>
-        <w:rPr>
-          <w:lang w:val="en-US"/>
-        </w:rPr>
-        <w:t>(C#),</w:t>
-      </w:r>
-      <w:r>
-        <w:rPr>
-          <w:lang w:val="en-US"/>
-        </w:rPr>
-        <w:t xml:space="preserve"> </w:t>
-      </w:r>
-      <w:proofErr w:type="spellStart"/>
-      <w:r>
-        <w:rPr>
-          <w:lang w:val="en-US"/>
-        </w:rPr>
-        <w:t>TargetFramework</w:t>
-      </w:r>
-      <w:proofErr w:type="spellEnd"/>
-      <w:r>
-        <w:rPr>
-          <w:lang w:val="en-US"/>
-        </w:rPr>
-        <w:t xml:space="preserve"> = net6.0-windows,</w:t>
-      </w:r>
-      <w:r>
-        <w:rPr>
-          <w:lang w:val="en-US"/>
-        </w:rPr>
-        <w:t xml:space="preserve"> </w:t>
-      </w:r>
-      <w:r>
-        <w:rPr>
-          <w:lang w:val="en-US"/>
-        </w:rPr>
-        <w:t>Platform target = x64.</w:t>
+        <w:t xml:space="preserve"> = net6.0-windows, Platform target = x64.</w:t>
       </w:r>
     </w:p>
     <w:p>
@@ -1211,7 +1169,7 @@
     </w:p>
     <w:tbl>
       <w:tblPr>
-        <w:tblW w:w="9467" w:type="dxa"/>
+        <w:tblW w:w="9351" w:type="dxa"/>
         <w:tblBorders>
           <w:top w:val="single" w:sz="4" w:space="0" w:color="auto"/>
           <w:left w:val="single" w:sz="4" w:space="0" w:color="auto"/>
@@ -1229,9 +1187,9 @@
         <w:tblLook w:val="04A0" w:firstRow="1" w:lastRow="0" w:firstColumn="1" w:lastColumn="0" w:noHBand="0" w:noVBand="1"/>
       </w:tblPr>
       <w:tblGrid>
-        <w:gridCol w:w="3653"/>
-        <w:gridCol w:w="1871"/>
-        <w:gridCol w:w="3943"/>
+        <w:gridCol w:w="3983"/>
+        <w:gridCol w:w="2016"/>
+        <w:gridCol w:w="3352"/>
       </w:tblGrid>
       <w:tr>
         <w:trPr>
@@ -1239,7 +1197,7 @@
         </w:trPr>
         <w:tc>
           <w:tcPr>
-            <w:tcW w:w="3653" w:type="dxa"/>
+            <w:tcW w:w="3983" w:type="dxa"/>
             <w:noWrap/>
             <w:vAlign w:val="center"/>
             <w:hideMark/>
@@ -1250,12 +1208,14 @@
               <w:ind w:firstLine="0"/>
               <w:jc w:val="center"/>
               <w:rPr>
-                <w:sz w:val="22"/>
-              </w:rPr>
-            </w:pPr>
-            <w:r>
-              <w:rPr>
-                <w:sz w:val="22"/>
+                <w:sz w:val="24"/>
+                <w:szCs w:val="24"/>
+              </w:rPr>
+            </w:pPr>
+            <w:r>
+              <w:rPr>
+                <w:sz w:val="24"/>
+                <w:szCs w:val="24"/>
               </w:rPr>
               <w:t>Название</w:t>
             </w:r>
@@ -1263,7 +1223,7 @@
         </w:tc>
         <w:tc>
           <w:tcPr>
-            <w:tcW w:w="1871" w:type="dxa"/>
+            <w:tcW w:w="2016" w:type="dxa"/>
             <w:noWrap/>
             <w:vAlign w:val="center"/>
             <w:hideMark/>
@@ -1274,12 +1234,14 @@
               <w:ind w:firstLine="0"/>
               <w:jc w:val="center"/>
               <w:rPr>
-                <w:sz w:val="22"/>
-              </w:rPr>
-            </w:pPr>
-            <w:r>
-              <w:rPr>
-                <w:sz w:val="22"/>
+                <w:sz w:val="24"/>
+                <w:szCs w:val="24"/>
+              </w:rPr>
+            </w:pPr>
+            <w:r>
+              <w:rPr>
+                <w:sz w:val="24"/>
+                <w:szCs w:val="24"/>
               </w:rPr>
               <w:t>Тип данных</w:t>
             </w:r>
@@ -1287,7 +1249,7 @@
         </w:tc>
         <w:tc>
           <w:tcPr>
-            <w:tcW w:w="3943" w:type="dxa"/>
+            <w:tcW w:w="3352" w:type="dxa"/>
             <w:noWrap/>
             <w:vAlign w:val="center"/>
             <w:hideMark/>
@@ -1298,12 +1260,14 @@
               <w:ind w:firstLine="0"/>
               <w:jc w:val="center"/>
               <w:rPr>
-                <w:sz w:val="22"/>
-              </w:rPr>
-            </w:pPr>
-            <w:r>
-              <w:rPr>
-                <w:sz w:val="22"/>
+                <w:sz w:val="24"/>
+                <w:szCs w:val="24"/>
+              </w:rPr>
+            </w:pPr>
+            <w:r>
+              <w:rPr>
+                <w:sz w:val="24"/>
+                <w:szCs w:val="24"/>
               </w:rPr>
               <w:t>Описание</w:t>
             </w:r>
@@ -1313,7 +1277,7 @@
       <w:tr>
         <w:tc>
           <w:tcPr>
-            <w:tcW w:w="3653" w:type="dxa"/>
+            <w:tcW w:w="3983" w:type="dxa"/>
             <w:vAlign w:val="bottom"/>
             <w:hideMark/>
           </w:tcPr>
@@ -1322,12 +1286,14 @@
               <w:spacing w:line="240" w:lineRule="auto"/>
               <w:ind w:firstLine="0"/>
               <w:rPr>
-                <w:sz w:val="22"/>
-              </w:rPr>
-            </w:pPr>
-            <w:r>
-              <w:rPr>
-                <w:sz w:val="22"/>
+                <w:sz w:val="24"/>
+                <w:szCs w:val="24"/>
+              </w:rPr>
+            </w:pPr>
+            <w:r>
+              <w:rPr>
+                <w:sz w:val="24"/>
+                <w:szCs w:val="24"/>
               </w:rPr>
               <w:t>Application.DocumentManager</w:t>
             </w:r>
@@ -1335,7 +1301,7 @@
         </w:tc>
         <w:tc>
           <w:tcPr>
-            <w:tcW w:w="1871" w:type="dxa"/>
+            <w:tcW w:w="2016" w:type="dxa"/>
             <w:vAlign w:val="bottom"/>
             <w:hideMark/>
           </w:tcPr>
@@ -1344,12 +1310,14 @@
               <w:spacing w:line="240" w:lineRule="auto"/>
               <w:ind w:firstLine="0"/>
               <w:rPr>
-                <w:sz w:val="22"/>
-              </w:rPr>
-            </w:pPr>
-            <w:r>
-              <w:rPr>
-                <w:sz w:val="22"/>
+                <w:sz w:val="24"/>
+                <w:szCs w:val="24"/>
+              </w:rPr>
+            </w:pPr>
+            <w:r>
+              <w:rPr>
+                <w:sz w:val="24"/>
+                <w:szCs w:val="24"/>
               </w:rPr>
               <w:t>DocumentManager</w:t>
             </w:r>
@@ -1357,7 +1325,7 @@
         </w:tc>
         <w:tc>
           <w:tcPr>
-            <w:tcW w:w="3943" w:type="dxa"/>
+            <w:tcW w:w="3352" w:type="dxa"/>
             <w:vAlign w:val="bottom"/>
             <w:hideMark/>
           </w:tcPr>
@@ -1366,12 +1334,14 @@
               <w:spacing w:line="240" w:lineRule="auto"/>
               <w:ind w:firstLine="0"/>
               <w:rPr>
-                <w:sz w:val="22"/>
-              </w:rPr>
-            </w:pPr>
-            <w:r>
-              <w:rPr>
-                <w:sz w:val="22"/>
+                <w:sz w:val="24"/>
+                <w:szCs w:val="24"/>
+              </w:rPr>
+            </w:pPr>
+            <w:r>
+              <w:rPr>
+                <w:sz w:val="24"/>
+                <w:szCs w:val="24"/>
               </w:rPr>
               <w:t>Доступ к менеджеру открытых документов nanoCAD</w:t>
             </w:r>
@@ -1381,7 +1351,7 @@
       <w:tr>
         <w:tc>
           <w:tcPr>
-            <w:tcW w:w="3653" w:type="dxa"/>
+            <w:tcW w:w="3983" w:type="dxa"/>
             <w:vAlign w:val="bottom"/>
             <w:hideMark/>
           </w:tcPr>
@@ -1390,12 +1360,14 @@
               <w:spacing w:line="240" w:lineRule="auto"/>
               <w:ind w:firstLine="0"/>
               <w:rPr>
-                <w:sz w:val="22"/>
-              </w:rPr>
-            </w:pPr>
-            <w:r>
-              <w:rPr>
-                <w:sz w:val="22"/>
+                <w:sz w:val="24"/>
+                <w:szCs w:val="24"/>
+              </w:rPr>
+            </w:pPr>
+            <w:r>
+              <w:rPr>
+                <w:sz w:val="24"/>
+                <w:szCs w:val="24"/>
               </w:rPr>
               <w:t>DocumentManager.MdiActiveDocument</w:t>
             </w:r>
@@ -1403,7 +1375,7 @@
         </w:tc>
         <w:tc>
           <w:tcPr>
-            <w:tcW w:w="1871" w:type="dxa"/>
+            <w:tcW w:w="2016" w:type="dxa"/>
             <w:vAlign w:val="bottom"/>
             <w:hideMark/>
           </w:tcPr>
@@ -1412,12 +1384,14 @@
               <w:spacing w:line="240" w:lineRule="auto"/>
               <w:ind w:firstLine="0"/>
               <w:rPr>
-                <w:sz w:val="22"/>
-              </w:rPr>
-            </w:pPr>
-            <w:r>
-              <w:rPr>
-                <w:sz w:val="22"/>
+                <w:sz w:val="24"/>
+                <w:szCs w:val="24"/>
+              </w:rPr>
+            </w:pPr>
+            <w:r>
+              <w:rPr>
+                <w:sz w:val="24"/>
+                <w:szCs w:val="24"/>
               </w:rPr>
               <w:t>Document</w:t>
             </w:r>
@@ -1425,7 +1399,7 @@
         </w:tc>
         <w:tc>
           <w:tcPr>
-            <w:tcW w:w="3943" w:type="dxa"/>
+            <w:tcW w:w="3352" w:type="dxa"/>
             <w:vAlign w:val="bottom"/>
             <w:hideMark/>
           </w:tcPr>
@@ -1434,12 +1408,14 @@
               <w:spacing w:line="240" w:lineRule="auto"/>
               <w:ind w:firstLine="0"/>
               <w:rPr>
-                <w:sz w:val="22"/>
-              </w:rPr>
-            </w:pPr>
-            <w:r>
-              <w:rPr>
-                <w:sz w:val="22"/>
+                <w:sz w:val="24"/>
+                <w:szCs w:val="24"/>
+              </w:rPr>
+            </w:pPr>
+            <w:r>
+              <w:rPr>
+                <w:sz w:val="24"/>
+                <w:szCs w:val="24"/>
               </w:rPr>
               <w:t>Активный (текущий) документ nanoCAD</w:t>
             </w:r>
@@ -1449,7 +1425,7 @@
       <w:tr>
         <w:tc>
           <w:tcPr>
-            <w:tcW w:w="3653" w:type="dxa"/>
+            <w:tcW w:w="3983" w:type="dxa"/>
             <w:vAlign w:val="bottom"/>
             <w:hideMark/>
           </w:tcPr>
@@ -1458,12 +1434,14 @@
               <w:spacing w:line="240" w:lineRule="auto"/>
               <w:ind w:firstLine="0"/>
               <w:rPr>
-                <w:sz w:val="22"/>
-              </w:rPr>
-            </w:pPr>
-            <w:r>
-              <w:rPr>
-                <w:sz w:val="22"/>
+                <w:sz w:val="24"/>
+                <w:szCs w:val="24"/>
+              </w:rPr>
+            </w:pPr>
+            <w:r>
+              <w:rPr>
+                <w:sz w:val="24"/>
+                <w:szCs w:val="24"/>
               </w:rPr>
               <w:t>Document.Database</w:t>
             </w:r>
@@ -1471,7 +1449,7 @@
         </w:tc>
         <w:tc>
           <w:tcPr>
-            <w:tcW w:w="1871" w:type="dxa"/>
+            <w:tcW w:w="2016" w:type="dxa"/>
             <w:vAlign w:val="bottom"/>
             <w:hideMark/>
           </w:tcPr>
@@ -1480,12 +1458,14 @@
               <w:spacing w:line="240" w:lineRule="auto"/>
               <w:ind w:firstLine="0"/>
               <w:rPr>
-                <w:sz w:val="22"/>
-              </w:rPr>
-            </w:pPr>
-            <w:r>
-              <w:rPr>
-                <w:sz w:val="22"/>
+                <w:sz w:val="24"/>
+                <w:szCs w:val="24"/>
+              </w:rPr>
+            </w:pPr>
+            <w:r>
+              <w:rPr>
+                <w:sz w:val="24"/>
+                <w:szCs w:val="24"/>
               </w:rPr>
               <w:t>Database</w:t>
             </w:r>
@@ -1493,7 +1473,7 @@
         </w:tc>
         <w:tc>
           <w:tcPr>
-            <w:tcW w:w="3943" w:type="dxa"/>
+            <w:tcW w:w="3352" w:type="dxa"/>
             <w:vAlign w:val="bottom"/>
             <w:hideMark/>
           </w:tcPr>
@@ -1502,12 +1482,14 @@
               <w:spacing w:line="240" w:lineRule="auto"/>
               <w:ind w:firstLine="0"/>
               <w:rPr>
-                <w:sz w:val="22"/>
-              </w:rPr>
-            </w:pPr>
-            <w:r>
-              <w:rPr>
-                <w:sz w:val="22"/>
+                <w:sz w:val="24"/>
+                <w:szCs w:val="24"/>
+              </w:rPr>
+            </w:pPr>
+            <w:r>
+              <w:rPr>
+                <w:sz w:val="24"/>
+                <w:szCs w:val="24"/>
               </w:rPr>
               <w:t>База данных текущего документа (чертежа), в которую добавляются сущности</w:t>
             </w:r>
@@ -1517,7 +1499,7 @@
       <w:tr>
         <w:tc>
           <w:tcPr>
-            <w:tcW w:w="3653" w:type="dxa"/>
+            <w:tcW w:w="3983" w:type="dxa"/>
             <w:vAlign w:val="bottom"/>
             <w:hideMark/>
           </w:tcPr>
@@ -1526,12 +1508,14 @@
               <w:spacing w:line="240" w:lineRule="auto"/>
               <w:ind w:firstLine="0"/>
               <w:rPr>
-                <w:sz w:val="22"/>
-              </w:rPr>
-            </w:pPr>
-            <w:r>
-              <w:rPr>
-                <w:sz w:val="22"/>
+                <w:sz w:val="24"/>
+                <w:szCs w:val="24"/>
+              </w:rPr>
+            </w:pPr>
+            <w:r>
+              <w:rPr>
+                <w:sz w:val="24"/>
+                <w:szCs w:val="24"/>
               </w:rPr>
               <w:t>Database.TransactionManager</w:t>
             </w:r>
@@ -1539,7 +1523,7 @@
         </w:tc>
         <w:tc>
           <w:tcPr>
-            <w:tcW w:w="1871" w:type="dxa"/>
+            <w:tcW w:w="2016" w:type="dxa"/>
             <w:vAlign w:val="bottom"/>
             <w:hideMark/>
           </w:tcPr>
@@ -1548,12 +1532,14 @@
               <w:spacing w:line="240" w:lineRule="auto"/>
               <w:ind w:firstLine="0"/>
               <w:rPr>
-                <w:sz w:val="22"/>
-              </w:rPr>
-            </w:pPr>
-            <w:r>
-              <w:rPr>
-                <w:sz w:val="22"/>
+                <w:sz w:val="24"/>
+                <w:szCs w:val="24"/>
+              </w:rPr>
+            </w:pPr>
+            <w:r>
+              <w:rPr>
+                <w:sz w:val="24"/>
+                <w:szCs w:val="24"/>
               </w:rPr>
               <w:t>TransactionManager</w:t>
             </w:r>
@@ -1561,7 +1547,7 @@
         </w:tc>
         <w:tc>
           <w:tcPr>
-            <w:tcW w:w="3943" w:type="dxa"/>
+            <w:tcW w:w="3352" w:type="dxa"/>
             <w:vAlign w:val="bottom"/>
             <w:hideMark/>
           </w:tcPr>
@@ -1570,12 +1556,14 @@
               <w:spacing w:line="240" w:lineRule="auto"/>
               <w:ind w:firstLine="0"/>
               <w:rPr>
-                <w:sz w:val="22"/>
-              </w:rPr>
-            </w:pPr>
-            <w:r>
-              <w:rPr>
-                <w:sz w:val="22"/>
+                <w:sz w:val="24"/>
+                <w:szCs w:val="24"/>
+              </w:rPr>
+            </w:pPr>
+            <w:r>
+              <w:rPr>
+                <w:sz w:val="24"/>
+                <w:szCs w:val="24"/>
               </w:rPr>
               <w:t>Менеджер транзакций для безопасной работы с объектами БД</w:t>
             </w:r>
@@ -1583,7 +1571,14 @@
         </w:tc>
       </w:tr>
     </w:tbl>
-    <w:p/>
+    <w:p>
+      <w:pPr>
+        <w:rPr>
+          <w:sz w:val="24"/>
+          <w:szCs w:val="24"/>
+        </w:rPr>
+      </w:pPr>
+    </w:p>
     <w:p>
       <w:pPr>
         <w:spacing w:line="240" w:lineRule="auto"/>
@@ -1637,10 +1632,10 @@
         <w:tblLook w:val="04A0" w:firstRow="1" w:lastRow="0" w:firstColumn="1" w:lastColumn="0" w:noHBand="0" w:noVBand="1"/>
       </w:tblPr>
       <w:tblGrid>
-        <w:gridCol w:w="1685"/>
-        <w:gridCol w:w="2138"/>
-        <w:gridCol w:w="1484"/>
-        <w:gridCol w:w="4038"/>
+        <w:gridCol w:w="1730"/>
+        <w:gridCol w:w="2206"/>
+        <w:gridCol w:w="1478"/>
+        <w:gridCol w:w="3931"/>
       </w:tblGrid>
       <w:tr>
         <w:trPr>
@@ -1659,12 +1654,14 @@
               <w:ind w:firstLine="0"/>
               <w:jc w:val="center"/>
               <w:rPr>
-                <w:sz w:val="22"/>
-              </w:rPr>
-            </w:pPr>
-            <w:r>
-              <w:rPr>
-                <w:sz w:val="22"/>
+                <w:sz w:val="24"/>
+                <w:szCs w:val="24"/>
+              </w:rPr>
+            </w:pPr>
+            <w:r>
+              <w:rPr>
+                <w:sz w:val="24"/>
+                <w:szCs w:val="24"/>
               </w:rPr>
               <w:t>Название</w:t>
             </w:r>
@@ -1683,12 +1680,14 @@
               <w:ind w:firstLine="0"/>
               <w:jc w:val="center"/>
               <w:rPr>
-                <w:sz w:val="22"/>
-              </w:rPr>
-            </w:pPr>
-            <w:r>
-              <w:rPr>
-                <w:sz w:val="22"/>
+                <w:sz w:val="24"/>
+                <w:szCs w:val="24"/>
+              </w:rPr>
+            </w:pPr>
+            <w:r>
+              <w:rPr>
+                <w:sz w:val="24"/>
+                <w:szCs w:val="24"/>
               </w:rPr>
               <w:t>Входные параметры</w:t>
             </w:r>
@@ -1707,12 +1706,14 @@
               <w:ind w:firstLine="0"/>
               <w:jc w:val="center"/>
               <w:rPr>
-                <w:sz w:val="22"/>
-              </w:rPr>
-            </w:pPr>
-            <w:r>
-              <w:rPr>
-                <w:sz w:val="22"/>
+                <w:sz w:val="24"/>
+                <w:szCs w:val="24"/>
+              </w:rPr>
+            </w:pPr>
+            <w:r>
+              <w:rPr>
+                <w:sz w:val="24"/>
+                <w:szCs w:val="24"/>
               </w:rPr>
               <w:t>Тип возвращаемых данных</w:t>
             </w:r>
@@ -1731,12 +1732,14 @@
               <w:ind w:firstLine="0"/>
               <w:jc w:val="center"/>
               <w:rPr>
-                <w:sz w:val="22"/>
-              </w:rPr>
-            </w:pPr>
-            <w:r>
-              <w:rPr>
-                <w:sz w:val="22"/>
+                <w:sz w:val="24"/>
+                <w:szCs w:val="24"/>
+              </w:rPr>
+            </w:pPr>
+            <w:r>
+              <w:rPr>
+                <w:sz w:val="24"/>
+                <w:szCs w:val="24"/>
               </w:rPr>
               <w:t>Описание</w:t>
             </w:r>
@@ -1755,12 +1758,14 @@
               <w:spacing w:line="240" w:lineRule="auto"/>
               <w:ind w:firstLine="0"/>
               <w:rPr>
-                <w:sz w:val="22"/>
-              </w:rPr>
-            </w:pPr>
-            <w:r>
-              <w:rPr>
-                <w:sz w:val="22"/>
+                <w:sz w:val="24"/>
+                <w:szCs w:val="24"/>
+              </w:rPr>
+            </w:pPr>
+            <w:r>
+              <w:rPr>
+                <w:sz w:val="24"/>
+                <w:szCs w:val="24"/>
               </w:rPr>
               <w:t>CreateFrustum</w:t>
             </w:r>
@@ -1777,12 +1782,14 @@
               <w:spacing w:line="240" w:lineRule="auto"/>
               <w:ind w:firstLine="0"/>
               <w:rPr>
-                <w:sz w:val="22"/>
-              </w:rPr>
-            </w:pPr>
-            <w:r>
-              <w:rPr>
-                <w:sz w:val="22"/>
+                <w:sz w:val="24"/>
+                <w:szCs w:val="24"/>
+              </w:rPr>
+            </w:pPr>
+            <w:r>
+              <w:rPr>
+                <w:sz w:val="24"/>
+                <w:szCs w:val="24"/>
               </w:rPr>
               <w:t>(параметры высоты и радиусов)</w:t>
             </w:r>
@@ -1799,12 +1806,14 @@
               <w:spacing w:line="240" w:lineRule="auto"/>
               <w:ind w:firstLine="0"/>
               <w:rPr>
-                <w:sz w:val="22"/>
-              </w:rPr>
-            </w:pPr>
-            <w:r>
-              <w:rPr>
-                <w:sz w:val="22"/>
+                <w:sz w:val="24"/>
+                <w:szCs w:val="24"/>
+              </w:rPr>
+            </w:pPr>
+            <w:r>
+              <w:rPr>
+                <w:sz w:val="24"/>
+                <w:szCs w:val="24"/>
               </w:rPr>
               <w:t>void</w:t>
             </w:r>
@@ -1821,18 +1830,21 @@
               <w:spacing w:line="240" w:lineRule="auto"/>
               <w:ind w:firstLine="0"/>
               <w:rPr>
-                <w:sz w:val="22"/>
-              </w:rPr>
-            </w:pPr>
-            <w:r>
-              <w:rPr>
-                <w:sz w:val="22"/>
+                <w:sz w:val="24"/>
+                <w:szCs w:val="24"/>
+              </w:rPr>
+            </w:pPr>
+            <w:r>
+              <w:rPr>
+                <w:sz w:val="24"/>
+                <w:szCs w:val="24"/>
               </w:rPr>
               <w:t>Создаёт 3D</w:t>
             </w:r>
             <w:r>
               <w:rPr>
-                <w:sz w:val="22"/>
+                <w:sz w:val="24"/>
+                <w:szCs w:val="24"/>
               </w:rPr>
               <w:noBreakHyphen/>
               <w:t>тело типа усечённого конуса; при равных радиусах используется как цилиндр (для внешнего и внутреннего цилиндра шайбы)</w:t>
@@ -1852,12 +1864,14 @@
               <w:spacing w:line="240" w:lineRule="auto"/>
               <w:ind w:firstLine="0"/>
               <w:rPr>
-                <w:sz w:val="22"/>
-              </w:rPr>
-            </w:pPr>
-            <w:r>
-              <w:rPr>
-                <w:sz w:val="22"/>
+                <w:sz w:val="24"/>
+                <w:szCs w:val="24"/>
+              </w:rPr>
+            </w:pPr>
+            <w:r>
+              <w:rPr>
+                <w:sz w:val="24"/>
+                <w:szCs w:val="24"/>
               </w:rPr>
               <w:t>BooleanOperation</w:t>
             </w:r>
@@ -1874,12 +1888,14 @@
               <w:spacing w:line="240" w:lineRule="auto"/>
               <w:ind w:firstLine="0"/>
               <w:rPr>
-                <w:sz w:val="22"/>
-              </w:rPr>
-            </w:pPr>
-            <w:r>
-              <w:rPr>
-                <w:sz w:val="22"/>
+                <w:sz w:val="24"/>
+                <w:szCs w:val="24"/>
+              </w:rPr>
+            </w:pPr>
+            <w:r>
+              <w:rPr>
+                <w:sz w:val="24"/>
+                <w:szCs w:val="24"/>
               </w:rPr>
               <w:t>BooleanOperationType operation,</w:t>
             </w:r>
@@ -1889,12 +1905,14 @@
               <w:spacing w:line="240" w:lineRule="auto"/>
               <w:ind w:firstLine="0"/>
               <w:rPr>
-                <w:sz w:val="22"/>
-              </w:rPr>
-            </w:pPr>
-            <w:r>
-              <w:rPr>
-                <w:sz w:val="22"/>
+                <w:sz w:val="24"/>
+                <w:szCs w:val="24"/>
+              </w:rPr>
+            </w:pPr>
+            <w:r>
+              <w:rPr>
+                <w:sz w:val="24"/>
+                <w:szCs w:val="24"/>
               </w:rPr>
               <w:t>Solid3d other</w:t>
             </w:r>
@@ -1911,12 +1929,14 @@
               <w:spacing w:line="240" w:lineRule="auto"/>
               <w:ind w:firstLine="0"/>
               <w:rPr>
-                <w:sz w:val="22"/>
-              </w:rPr>
-            </w:pPr>
-            <w:r>
-              <w:rPr>
-                <w:sz w:val="22"/>
+                <w:sz w:val="24"/>
+                <w:szCs w:val="24"/>
+              </w:rPr>
+            </w:pPr>
+            <w:r>
+              <w:rPr>
+                <w:sz w:val="24"/>
+                <w:szCs w:val="24"/>
               </w:rPr>
               <w:t>void</w:t>
             </w:r>
@@ -1933,12 +1953,14 @@
               <w:spacing w:line="240" w:lineRule="auto"/>
               <w:ind w:firstLine="0"/>
               <w:rPr>
-                <w:sz w:val="22"/>
-              </w:rPr>
-            </w:pPr>
-            <w:r>
-              <w:rPr>
-                <w:sz w:val="22"/>
+                <w:sz w:val="24"/>
+                <w:szCs w:val="24"/>
+              </w:rPr>
+            </w:pPr>
+            <w:r>
+              <w:rPr>
+                <w:sz w:val="24"/>
+                <w:szCs w:val="24"/>
               </w:rPr>
               <w:t>Выполняет логическую операцию над телами (объединение/пересечение/вычитание). В проекте используется вычитание внутреннего цилиндра из внешнего</w:t>
             </w:r>
@@ -1974,15 +1996,12 @@
         <w:t>3</w:t>
       </w:r>
       <w:r>
-        <w:t xml:space="preserve"> –</w:t>
-      </w:r>
-      <w:r>
-        <w:t xml:space="preserve"> Используемые члены перечисленияBooleanOperationType</w:t>
+        <w:t xml:space="preserve"> – Используемые члены перечисленияBooleanOperationType</w:t>
       </w:r>
     </w:p>
     <w:tbl>
       <w:tblPr>
-        <w:tblW w:w="9069" w:type="dxa"/>
+        <w:tblW w:w="9351" w:type="dxa"/>
         <w:tblBorders>
           <w:top w:val="single" w:sz="4" w:space="0" w:color="auto"/>
           <w:left w:val="single" w:sz="4" w:space="0" w:color="auto"/>
@@ -2000,9 +2019,9 @@
         <w:tblLook w:val="04A0" w:firstRow="1" w:lastRow="0" w:firstColumn="1" w:lastColumn="0" w:noHBand="0" w:noVBand="1"/>
       </w:tblPr>
       <w:tblGrid>
-        <w:gridCol w:w="1737"/>
-        <w:gridCol w:w="2992"/>
-        <w:gridCol w:w="4340"/>
+        <w:gridCol w:w="1735"/>
+        <w:gridCol w:w="2994"/>
+        <w:gridCol w:w="4622"/>
       </w:tblGrid>
       <w:tr>
         <w:trPr>
@@ -2021,12 +2040,14 @@
               <w:ind w:firstLine="0"/>
               <w:jc w:val="center"/>
               <w:rPr>
-                <w:sz w:val="22"/>
-              </w:rPr>
-            </w:pPr>
-            <w:r>
-              <w:rPr>
-                <w:sz w:val="22"/>
+                <w:sz w:val="24"/>
+                <w:szCs w:val="24"/>
+              </w:rPr>
+            </w:pPr>
+            <w:r>
+              <w:rPr>
+                <w:sz w:val="24"/>
+                <w:szCs w:val="24"/>
               </w:rPr>
               <w:t>Название</w:t>
             </w:r>
@@ -2045,12 +2066,14 @@
               <w:ind w:firstLine="0"/>
               <w:jc w:val="center"/>
               <w:rPr>
-                <w:sz w:val="22"/>
-              </w:rPr>
-            </w:pPr>
-            <w:r>
-              <w:rPr>
-                <w:sz w:val="22"/>
+                <w:sz w:val="24"/>
+                <w:szCs w:val="24"/>
+              </w:rPr>
+            </w:pPr>
+            <w:r>
+              <w:rPr>
+                <w:sz w:val="24"/>
+                <w:szCs w:val="24"/>
               </w:rPr>
               <w:t>Тип данных</w:t>
             </w:r>
@@ -2058,7 +2081,7 @@
         </w:tc>
         <w:tc>
           <w:tcPr>
-            <w:tcW w:w="4340" w:type="dxa"/>
+            <w:tcW w:w="4622" w:type="dxa"/>
             <w:noWrap/>
             <w:vAlign w:val="center"/>
             <w:hideMark/>
@@ -2069,12 +2092,14 @@
               <w:ind w:firstLine="0"/>
               <w:jc w:val="center"/>
               <w:rPr>
-                <w:sz w:val="22"/>
-              </w:rPr>
-            </w:pPr>
-            <w:r>
-              <w:rPr>
-                <w:sz w:val="22"/>
+                <w:sz w:val="24"/>
+                <w:szCs w:val="24"/>
+              </w:rPr>
+            </w:pPr>
+            <w:r>
+              <w:rPr>
+                <w:sz w:val="24"/>
+                <w:szCs w:val="24"/>
               </w:rPr>
               <w:t>Описание</w:t>
             </w:r>
@@ -2093,12 +2118,14 @@
               <w:spacing w:line="240" w:lineRule="auto"/>
               <w:ind w:firstLine="0"/>
               <w:rPr>
-                <w:sz w:val="22"/>
-              </w:rPr>
-            </w:pPr>
-            <w:r>
-              <w:rPr>
-                <w:sz w:val="22"/>
+                <w:sz w:val="24"/>
+                <w:szCs w:val="24"/>
+              </w:rPr>
+            </w:pPr>
+            <w:r>
+              <w:rPr>
+                <w:sz w:val="24"/>
+                <w:szCs w:val="24"/>
               </w:rPr>
               <w:t>BoolUnite</w:t>
             </w:r>
@@ -2115,12 +2142,14 @@
               <w:spacing w:line="240" w:lineRule="auto"/>
               <w:ind w:firstLine="0"/>
               <w:rPr>
-                <w:sz w:val="22"/>
-              </w:rPr>
-            </w:pPr>
-            <w:r>
-              <w:rPr>
-                <w:sz w:val="22"/>
+                <w:sz w:val="24"/>
+                <w:szCs w:val="24"/>
+              </w:rPr>
+            </w:pPr>
+            <w:r>
+              <w:rPr>
+                <w:sz w:val="24"/>
+                <w:szCs w:val="24"/>
               </w:rPr>
               <w:t>BooleanOperationType</w:t>
             </w:r>
@@ -2128,7 +2157,7 @@
         </w:tc>
         <w:tc>
           <w:tcPr>
-            <w:tcW w:w="4340" w:type="dxa"/>
+            <w:tcW w:w="4622" w:type="dxa"/>
             <w:vAlign w:val="bottom"/>
             <w:hideMark/>
           </w:tcPr>
@@ -2137,12 +2166,14 @@
               <w:spacing w:line="240" w:lineRule="auto"/>
               <w:ind w:firstLine="0"/>
               <w:rPr>
-                <w:sz w:val="22"/>
-              </w:rPr>
-            </w:pPr>
-            <w:r>
-              <w:rPr>
-                <w:sz w:val="22"/>
+                <w:sz w:val="24"/>
+                <w:szCs w:val="24"/>
+              </w:rPr>
+            </w:pPr>
+            <w:r>
+              <w:rPr>
+                <w:sz w:val="24"/>
+                <w:szCs w:val="24"/>
               </w:rPr>
               <w:t>Логическая операция объединения</w:t>
             </w:r>
@@ -2161,12 +2192,14 @@
               <w:spacing w:line="240" w:lineRule="auto"/>
               <w:ind w:firstLine="0"/>
               <w:rPr>
-                <w:sz w:val="22"/>
-              </w:rPr>
-            </w:pPr>
-            <w:r>
-              <w:rPr>
-                <w:sz w:val="22"/>
+                <w:sz w:val="24"/>
+                <w:szCs w:val="24"/>
+              </w:rPr>
+            </w:pPr>
+            <w:r>
+              <w:rPr>
+                <w:sz w:val="24"/>
+                <w:szCs w:val="24"/>
               </w:rPr>
               <w:t>BoolIntersect</w:t>
             </w:r>
@@ -2183,12 +2216,14 @@
               <w:spacing w:line="240" w:lineRule="auto"/>
               <w:ind w:firstLine="0"/>
               <w:rPr>
-                <w:sz w:val="22"/>
-              </w:rPr>
-            </w:pPr>
-            <w:r>
-              <w:rPr>
-                <w:sz w:val="22"/>
+                <w:sz w:val="24"/>
+                <w:szCs w:val="24"/>
+              </w:rPr>
+            </w:pPr>
+            <w:r>
+              <w:rPr>
+                <w:sz w:val="24"/>
+                <w:szCs w:val="24"/>
               </w:rPr>
               <w:t>BooleanOperationType</w:t>
             </w:r>
@@ -2196,7 +2231,7 @@
         </w:tc>
         <w:tc>
           <w:tcPr>
-            <w:tcW w:w="4340" w:type="dxa"/>
+            <w:tcW w:w="4622" w:type="dxa"/>
             <w:vAlign w:val="bottom"/>
             <w:hideMark/>
           </w:tcPr>
@@ -2205,12 +2240,14 @@
               <w:spacing w:line="240" w:lineRule="auto"/>
               <w:ind w:firstLine="0"/>
               <w:rPr>
-                <w:sz w:val="22"/>
-              </w:rPr>
-            </w:pPr>
-            <w:r>
-              <w:rPr>
-                <w:sz w:val="22"/>
+                <w:sz w:val="24"/>
+                <w:szCs w:val="24"/>
+              </w:rPr>
+            </w:pPr>
+            <w:r>
+              <w:rPr>
+                <w:sz w:val="24"/>
+                <w:szCs w:val="24"/>
               </w:rPr>
               <w:t>Логическая операция пересечения</w:t>
             </w:r>
@@ -2229,12 +2266,14 @@
               <w:spacing w:line="240" w:lineRule="auto"/>
               <w:ind w:firstLine="0"/>
               <w:rPr>
-                <w:sz w:val="22"/>
-              </w:rPr>
-            </w:pPr>
-            <w:r>
-              <w:rPr>
-                <w:sz w:val="22"/>
+                <w:sz w:val="24"/>
+                <w:szCs w:val="24"/>
+              </w:rPr>
+            </w:pPr>
+            <w:r>
+              <w:rPr>
+                <w:sz w:val="24"/>
+                <w:szCs w:val="24"/>
               </w:rPr>
               <w:t>BoolSubtract</w:t>
             </w:r>
@@ -2251,12 +2290,14 @@
               <w:spacing w:line="240" w:lineRule="auto"/>
               <w:ind w:firstLine="0"/>
               <w:rPr>
-                <w:sz w:val="22"/>
-              </w:rPr>
-            </w:pPr>
-            <w:r>
-              <w:rPr>
-                <w:sz w:val="22"/>
+                <w:sz w:val="24"/>
+                <w:szCs w:val="24"/>
+              </w:rPr>
+            </w:pPr>
+            <w:r>
+              <w:rPr>
+                <w:sz w:val="24"/>
+                <w:szCs w:val="24"/>
               </w:rPr>
               <w:t>BooleanOperationType</w:t>
             </w:r>
@@ -2264,7 +2305,7 @@
         </w:tc>
         <w:tc>
           <w:tcPr>
-            <w:tcW w:w="4340" w:type="dxa"/>
+            <w:tcW w:w="4622" w:type="dxa"/>
             <w:vAlign w:val="bottom"/>
             <w:hideMark/>
           </w:tcPr>
@@ -2273,12 +2314,14 @@
               <w:spacing w:line="240" w:lineRule="auto"/>
               <w:ind w:firstLine="0"/>
               <w:rPr>
-                <w:sz w:val="22"/>
-              </w:rPr>
-            </w:pPr>
-            <w:r>
-              <w:rPr>
-                <w:sz w:val="22"/>
+                <w:sz w:val="24"/>
+                <w:szCs w:val="24"/>
+              </w:rPr>
+            </w:pPr>
+            <w:r>
+              <w:rPr>
+                <w:sz w:val="24"/>
+                <w:szCs w:val="24"/>
               </w:rPr>
               <w:t>Логическая операция вычитания (используется для создания отверстия)</w:t>
             </w:r>
@@ -2287,12 +2330,21 @@
       </w:tr>
     </w:tbl>
     <w:p/>
+    <w:p/>
+    <w:p>
+      <w:pPr>
+        <w:rPr>
+          <w:lang w:val="en-US"/>
+        </w:rPr>
+      </w:pPr>
+    </w:p>
     <w:p>
       <w:pPr>
         <w:spacing w:line="240" w:lineRule="auto"/>
         <w:ind w:firstLine="0"/>
       </w:pPr>
       <w:r>
+        <w:lastRenderedPageBreak/>
         <w:t xml:space="preserve">Таблица </w:t>
       </w:r>
       <w:r>
@@ -2357,12 +2409,14 @@
               <w:ind w:firstLine="0"/>
               <w:jc w:val="center"/>
               <w:rPr>
-                <w:sz w:val="22"/>
-              </w:rPr>
-            </w:pPr>
-            <w:r>
-              <w:rPr>
-                <w:sz w:val="22"/>
+                <w:sz w:val="24"/>
+                <w:szCs w:val="24"/>
+              </w:rPr>
+            </w:pPr>
+            <w:r>
+              <w:rPr>
+                <w:sz w:val="24"/>
+                <w:szCs w:val="24"/>
               </w:rPr>
               <w:t>Название</w:t>
             </w:r>
@@ -2381,12 +2435,14 @@
               <w:ind w:firstLine="0"/>
               <w:jc w:val="center"/>
               <w:rPr>
-                <w:sz w:val="22"/>
-              </w:rPr>
-            </w:pPr>
-            <w:r>
-              <w:rPr>
-                <w:sz w:val="22"/>
+                <w:sz w:val="24"/>
+                <w:szCs w:val="24"/>
+              </w:rPr>
+            </w:pPr>
+            <w:r>
+              <w:rPr>
+                <w:sz w:val="24"/>
+                <w:szCs w:val="24"/>
               </w:rPr>
               <w:t>Входные параметры</w:t>
             </w:r>
@@ -2405,12 +2461,14 @@
               <w:ind w:firstLine="0"/>
               <w:jc w:val="center"/>
               <w:rPr>
-                <w:sz w:val="22"/>
-              </w:rPr>
-            </w:pPr>
-            <w:r>
-              <w:rPr>
-                <w:sz w:val="22"/>
+                <w:sz w:val="24"/>
+                <w:szCs w:val="24"/>
+              </w:rPr>
+            </w:pPr>
+            <w:r>
+              <w:rPr>
+                <w:sz w:val="24"/>
+                <w:szCs w:val="24"/>
               </w:rPr>
               <w:t>Тип возвращаемых данных</w:t>
             </w:r>
@@ -2429,12 +2487,14 @@
               <w:ind w:firstLine="0"/>
               <w:jc w:val="center"/>
               <w:rPr>
-                <w:sz w:val="22"/>
-              </w:rPr>
-            </w:pPr>
-            <w:r>
-              <w:rPr>
-                <w:sz w:val="22"/>
+                <w:sz w:val="24"/>
+                <w:szCs w:val="24"/>
+              </w:rPr>
+            </w:pPr>
+            <w:r>
+              <w:rPr>
+                <w:sz w:val="24"/>
+                <w:szCs w:val="24"/>
               </w:rPr>
               <w:t>Описание</w:t>
             </w:r>
@@ -2453,12 +2513,14 @@
               <w:spacing w:line="240" w:lineRule="auto"/>
               <w:ind w:firstLine="0"/>
               <w:rPr>
-                <w:sz w:val="22"/>
-              </w:rPr>
-            </w:pPr>
-            <w:r>
-              <w:rPr>
-                <w:sz w:val="22"/>
+                <w:sz w:val="24"/>
+                <w:szCs w:val="24"/>
+              </w:rPr>
+            </w:pPr>
+            <w:r>
+              <w:rPr>
+                <w:sz w:val="24"/>
+                <w:szCs w:val="24"/>
               </w:rPr>
               <w:t>GetObject</w:t>
             </w:r>
@@ -2475,12 +2537,14 @@
               <w:spacing w:line="240" w:lineRule="auto"/>
               <w:ind w:firstLine="0"/>
               <w:rPr>
-                <w:sz w:val="22"/>
-              </w:rPr>
-            </w:pPr>
-            <w:r>
-              <w:rPr>
-                <w:sz w:val="22"/>
+                <w:sz w:val="24"/>
+                <w:szCs w:val="24"/>
+              </w:rPr>
+            </w:pPr>
+            <w:r>
+              <w:rPr>
+                <w:sz w:val="24"/>
+                <w:szCs w:val="24"/>
               </w:rPr>
               <w:t>(идентификатор объекта, режим открытия)</w:t>
             </w:r>
@@ -2497,12 +2561,14 @@
               <w:spacing w:line="240" w:lineRule="auto"/>
               <w:ind w:firstLine="0"/>
               <w:rPr>
-                <w:sz w:val="22"/>
-              </w:rPr>
-            </w:pPr>
-            <w:r>
-              <w:rPr>
-                <w:sz w:val="22"/>
+                <w:sz w:val="24"/>
+                <w:szCs w:val="24"/>
+              </w:rPr>
+            </w:pPr>
+            <w:r>
+              <w:rPr>
+                <w:sz w:val="24"/>
+                <w:szCs w:val="24"/>
               </w:rPr>
               <w:t>объект БД</w:t>
             </w:r>
@@ -2519,12 +2585,14 @@
               <w:spacing w:line="240" w:lineRule="auto"/>
               <w:ind w:firstLine="0"/>
               <w:rPr>
-                <w:sz w:val="22"/>
-              </w:rPr>
-            </w:pPr>
-            <w:r>
-              <w:rPr>
-                <w:sz w:val="22"/>
+                <w:sz w:val="24"/>
+                <w:szCs w:val="24"/>
+              </w:rPr>
+            </w:pPr>
+            <w:r>
+              <w:rPr>
+                <w:sz w:val="24"/>
+                <w:szCs w:val="24"/>
               </w:rPr>
               <w:t>Получение объекта БД чертежа по идентификатору (например, получение BlockTableRecord для добавления сущностей)</w:t>
             </w:r>
@@ -2543,14 +2611,15 @@
               <w:spacing w:line="240" w:lineRule="auto"/>
               <w:ind w:firstLine="0"/>
               <w:rPr>
-                <w:sz w:val="22"/>
-              </w:rPr>
-            </w:pPr>
-            <w:r>
-              <w:rPr>
-                <w:sz w:val="22"/>
-              </w:rPr>
-              <w:lastRenderedPageBreak/>
+                <w:sz w:val="24"/>
+                <w:szCs w:val="24"/>
+              </w:rPr>
+            </w:pPr>
+            <w:r>
+              <w:rPr>
+                <w:sz w:val="24"/>
+                <w:szCs w:val="24"/>
+              </w:rPr>
               <w:t>AddNewlyCreatedDBObject</w:t>
             </w:r>
           </w:p>
@@ -2566,12 +2635,14 @@
               <w:spacing w:line="240" w:lineRule="auto"/>
               <w:ind w:firstLine="0"/>
               <w:rPr>
-                <w:sz w:val="22"/>
-              </w:rPr>
-            </w:pPr>
-            <w:r>
-              <w:rPr>
-                <w:sz w:val="22"/>
+                <w:sz w:val="24"/>
+                <w:szCs w:val="24"/>
+              </w:rPr>
+            </w:pPr>
+            <w:r>
+              <w:rPr>
+                <w:sz w:val="24"/>
+                <w:szCs w:val="24"/>
               </w:rPr>
               <w:t>DBObject obj, bool add</w:t>
             </w:r>
@@ -2588,12 +2659,14 @@
               <w:spacing w:line="240" w:lineRule="auto"/>
               <w:ind w:firstLine="0"/>
               <w:rPr>
-                <w:sz w:val="22"/>
-              </w:rPr>
-            </w:pPr>
-            <w:r>
-              <w:rPr>
-                <w:sz w:val="22"/>
+                <w:sz w:val="24"/>
+                <w:szCs w:val="24"/>
+              </w:rPr>
+            </w:pPr>
+            <w:r>
+              <w:rPr>
+                <w:sz w:val="24"/>
+                <w:szCs w:val="24"/>
               </w:rPr>
               <w:t>void</w:t>
             </w:r>
@@ -2610,12 +2683,14 @@
               <w:spacing w:line="240" w:lineRule="auto"/>
               <w:ind w:firstLine="0"/>
               <w:rPr>
-                <w:sz w:val="22"/>
-              </w:rPr>
-            </w:pPr>
-            <w:r>
-              <w:rPr>
-                <w:sz w:val="22"/>
+                <w:sz w:val="24"/>
+                <w:szCs w:val="24"/>
+              </w:rPr>
+            </w:pPr>
+            <w:r>
+              <w:rPr>
+                <w:sz w:val="24"/>
+                <w:szCs w:val="24"/>
               </w:rPr>
               <w:t>Регистрирует вновь созданный объект в текущей транзакции</w:t>
             </w:r>
@@ -2634,12 +2709,14 @@
               <w:spacing w:line="240" w:lineRule="auto"/>
               <w:ind w:firstLine="0"/>
               <w:rPr>
-                <w:sz w:val="22"/>
-              </w:rPr>
-            </w:pPr>
-            <w:r>
-              <w:rPr>
-                <w:sz w:val="22"/>
+                <w:sz w:val="24"/>
+                <w:szCs w:val="24"/>
+              </w:rPr>
+            </w:pPr>
+            <w:r>
+              <w:rPr>
+                <w:sz w:val="24"/>
+                <w:szCs w:val="24"/>
               </w:rPr>
               <w:t>Commit</w:t>
             </w:r>
@@ -2656,12 +2733,14 @@
               <w:spacing w:line="240" w:lineRule="auto"/>
               <w:ind w:firstLine="0"/>
               <w:rPr>
-                <w:sz w:val="22"/>
-              </w:rPr>
-            </w:pPr>
-            <w:r>
-              <w:rPr>
-                <w:sz w:val="22"/>
+                <w:sz w:val="24"/>
+                <w:szCs w:val="24"/>
+              </w:rPr>
+            </w:pPr>
+            <w:r>
+              <w:rPr>
+                <w:sz w:val="24"/>
+                <w:szCs w:val="24"/>
               </w:rPr>
               <w:t>—</w:t>
             </w:r>
@@ -2678,12 +2757,14 @@
               <w:spacing w:line="240" w:lineRule="auto"/>
               <w:ind w:firstLine="0"/>
               <w:rPr>
-                <w:sz w:val="22"/>
-              </w:rPr>
-            </w:pPr>
-            <w:r>
-              <w:rPr>
-                <w:sz w:val="22"/>
+                <w:sz w:val="24"/>
+                <w:szCs w:val="24"/>
+              </w:rPr>
+            </w:pPr>
+            <w:r>
+              <w:rPr>
+                <w:sz w:val="24"/>
+                <w:szCs w:val="24"/>
               </w:rPr>
               <w:t>void</w:t>
             </w:r>
@@ -2700,12 +2781,14 @@
               <w:spacing w:line="240" w:lineRule="auto"/>
               <w:ind w:firstLine="0"/>
               <w:rPr>
-                <w:sz w:val="22"/>
-              </w:rPr>
-            </w:pPr>
-            <w:r>
-              <w:rPr>
-                <w:sz w:val="22"/>
+                <w:sz w:val="24"/>
+                <w:szCs w:val="24"/>
+              </w:rPr>
+            </w:pPr>
+            <w:r>
+              <w:rPr>
+                <w:sz w:val="24"/>
+                <w:szCs w:val="24"/>
               </w:rPr>
               <w:t>Фиксирует изменения и завершает транзакцию</w:t>
             </w:r>
@@ -2724,12 +2807,14 @@
               <w:spacing w:line="240" w:lineRule="auto"/>
               <w:ind w:firstLine="0"/>
               <w:rPr>
-                <w:sz w:val="22"/>
-              </w:rPr>
-            </w:pPr>
-            <w:r>
-              <w:rPr>
-                <w:sz w:val="22"/>
+                <w:sz w:val="24"/>
+                <w:szCs w:val="24"/>
+              </w:rPr>
+            </w:pPr>
+            <w:r>
+              <w:rPr>
+                <w:sz w:val="24"/>
+                <w:szCs w:val="24"/>
               </w:rPr>
               <w:t>Abort</w:t>
             </w:r>
@@ -2746,12 +2831,14 @@
               <w:spacing w:line="240" w:lineRule="auto"/>
               <w:ind w:firstLine="0"/>
               <w:rPr>
-                <w:sz w:val="22"/>
-              </w:rPr>
-            </w:pPr>
-            <w:r>
-              <w:rPr>
-                <w:sz w:val="22"/>
+                <w:sz w:val="24"/>
+                <w:szCs w:val="24"/>
+              </w:rPr>
+            </w:pPr>
+            <w:r>
+              <w:rPr>
+                <w:sz w:val="24"/>
+                <w:szCs w:val="24"/>
               </w:rPr>
               <w:t>—</w:t>
             </w:r>
@@ -2768,12 +2855,14 @@
               <w:spacing w:line="240" w:lineRule="auto"/>
               <w:ind w:firstLine="0"/>
               <w:rPr>
-                <w:sz w:val="22"/>
-              </w:rPr>
-            </w:pPr>
-            <w:r>
-              <w:rPr>
-                <w:sz w:val="22"/>
+                <w:sz w:val="24"/>
+                <w:szCs w:val="24"/>
+              </w:rPr>
+            </w:pPr>
+            <w:r>
+              <w:rPr>
+                <w:sz w:val="24"/>
+                <w:szCs w:val="24"/>
               </w:rPr>
               <w:t>void</w:t>
             </w:r>
@@ -2790,12 +2879,14 @@
               <w:spacing w:line="240" w:lineRule="auto"/>
               <w:ind w:firstLine="0"/>
               <w:rPr>
-                <w:sz w:val="22"/>
-              </w:rPr>
-            </w:pPr>
-            <w:r>
-              <w:rPr>
-                <w:sz w:val="22"/>
+                <w:sz w:val="24"/>
+                <w:szCs w:val="24"/>
+              </w:rPr>
+            </w:pPr>
+            <w:r>
+              <w:rPr>
+                <w:sz w:val="24"/>
+                <w:szCs w:val="24"/>
               </w:rPr>
               <w:t>Прерывает транзакцию без применения изменений</w:t>
             </w:r>
@@ -2867,12 +2958,14 @@
               <w:ind w:firstLine="0"/>
               <w:jc w:val="center"/>
               <w:rPr>
-                <w:sz w:val="22"/>
-              </w:rPr>
-            </w:pPr>
-            <w:r>
-              <w:rPr>
-                <w:sz w:val="22"/>
+                <w:sz w:val="24"/>
+                <w:szCs w:val="24"/>
+              </w:rPr>
+            </w:pPr>
+            <w:r>
+              <w:rPr>
+                <w:sz w:val="24"/>
+                <w:szCs w:val="24"/>
               </w:rPr>
               <w:t>Название</w:t>
             </w:r>
@@ -2891,12 +2984,14 @@
               <w:ind w:firstLine="0"/>
               <w:jc w:val="center"/>
               <w:rPr>
-                <w:sz w:val="22"/>
-              </w:rPr>
-            </w:pPr>
-            <w:r>
-              <w:rPr>
-                <w:sz w:val="22"/>
+                <w:sz w:val="24"/>
+                <w:szCs w:val="24"/>
+              </w:rPr>
+            </w:pPr>
+            <w:r>
+              <w:rPr>
+                <w:sz w:val="24"/>
+                <w:szCs w:val="24"/>
               </w:rPr>
               <w:t>Входные параметры</w:t>
             </w:r>
@@ -2915,12 +3010,14 @@
               <w:ind w:firstLine="0"/>
               <w:jc w:val="center"/>
               <w:rPr>
-                <w:sz w:val="22"/>
-              </w:rPr>
-            </w:pPr>
-            <w:r>
-              <w:rPr>
-                <w:sz w:val="22"/>
+                <w:sz w:val="24"/>
+                <w:szCs w:val="24"/>
+              </w:rPr>
+            </w:pPr>
+            <w:r>
+              <w:rPr>
+                <w:sz w:val="24"/>
+                <w:szCs w:val="24"/>
               </w:rPr>
               <w:t>Тип возвращаемых данных</w:t>
             </w:r>
@@ -2939,12 +3036,14 @@
               <w:ind w:firstLine="0"/>
               <w:jc w:val="center"/>
               <w:rPr>
-                <w:sz w:val="22"/>
-              </w:rPr>
-            </w:pPr>
-            <w:r>
-              <w:rPr>
-                <w:sz w:val="22"/>
+                <w:sz w:val="24"/>
+                <w:szCs w:val="24"/>
+              </w:rPr>
+            </w:pPr>
+            <w:r>
+              <w:rPr>
+                <w:sz w:val="24"/>
+                <w:szCs w:val="24"/>
               </w:rPr>
               <w:t>Описание</w:t>
             </w:r>
@@ -2963,12 +3062,14 @@
               <w:spacing w:line="240" w:lineRule="auto"/>
               <w:ind w:firstLine="0"/>
               <w:rPr>
-                <w:sz w:val="22"/>
-              </w:rPr>
-            </w:pPr>
-            <w:r>
-              <w:rPr>
-                <w:sz w:val="22"/>
+                <w:sz w:val="24"/>
+                <w:szCs w:val="24"/>
+              </w:rPr>
+            </w:pPr>
+            <w:r>
+              <w:rPr>
+                <w:sz w:val="24"/>
+                <w:szCs w:val="24"/>
               </w:rPr>
               <w:t>StartTransaction</w:t>
             </w:r>
@@ -2985,12 +3086,14 @@
               <w:spacing w:line="240" w:lineRule="auto"/>
               <w:ind w:firstLine="0"/>
               <w:rPr>
-                <w:sz w:val="22"/>
-              </w:rPr>
-            </w:pPr>
-            <w:r>
-              <w:rPr>
-                <w:sz w:val="22"/>
+                <w:sz w:val="24"/>
+                <w:szCs w:val="24"/>
+              </w:rPr>
+            </w:pPr>
+            <w:r>
+              <w:rPr>
+                <w:sz w:val="24"/>
+                <w:szCs w:val="24"/>
               </w:rPr>
               <w:t>—</w:t>
             </w:r>
@@ -3007,12 +3110,14 @@
               <w:spacing w:line="240" w:lineRule="auto"/>
               <w:ind w:firstLine="0"/>
               <w:rPr>
-                <w:sz w:val="22"/>
-              </w:rPr>
-            </w:pPr>
-            <w:r>
-              <w:rPr>
-                <w:sz w:val="22"/>
+                <w:sz w:val="24"/>
+                <w:szCs w:val="24"/>
+              </w:rPr>
+            </w:pPr>
+            <w:r>
+              <w:rPr>
+                <w:sz w:val="24"/>
+                <w:szCs w:val="24"/>
               </w:rPr>
               <w:t>Transaction</w:t>
             </w:r>
@@ -3029,12 +3134,14 @@
               <w:spacing w:line="240" w:lineRule="auto"/>
               <w:ind w:firstLine="0"/>
               <w:rPr>
-                <w:sz w:val="22"/>
-              </w:rPr>
-            </w:pPr>
-            <w:r>
-              <w:rPr>
-                <w:sz w:val="22"/>
+                <w:sz w:val="24"/>
+                <w:szCs w:val="24"/>
+              </w:rPr>
+            </w:pPr>
+            <w:r>
+              <w:rPr>
+                <w:sz w:val="24"/>
+                <w:szCs w:val="24"/>
               </w:rPr>
               <w:t>Запускает новую транзакцию для работы с БД чертежа</w:t>
             </w:r>
@@ -3053,12 +3160,14 @@
               <w:spacing w:line="240" w:lineRule="auto"/>
               <w:ind w:firstLine="0"/>
               <w:rPr>
-                <w:sz w:val="22"/>
-              </w:rPr>
-            </w:pPr>
-            <w:r>
-              <w:rPr>
-                <w:sz w:val="22"/>
+                <w:sz w:val="24"/>
+                <w:szCs w:val="24"/>
+              </w:rPr>
+            </w:pPr>
+            <w:r>
+              <w:rPr>
+                <w:sz w:val="24"/>
+                <w:szCs w:val="24"/>
               </w:rPr>
               <w:t>StartOpenCloseTransaction</w:t>
             </w:r>
@@ -3075,12 +3184,14 @@
               <w:spacing w:line="240" w:lineRule="auto"/>
               <w:ind w:firstLine="0"/>
               <w:rPr>
-                <w:sz w:val="22"/>
-              </w:rPr>
-            </w:pPr>
-            <w:r>
-              <w:rPr>
-                <w:sz w:val="22"/>
+                <w:sz w:val="24"/>
+                <w:szCs w:val="24"/>
+              </w:rPr>
+            </w:pPr>
+            <w:r>
+              <w:rPr>
+                <w:sz w:val="24"/>
+                <w:szCs w:val="24"/>
               </w:rPr>
               <w:t>—</w:t>
             </w:r>
@@ -3097,12 +3208,14 @@
               <w:spacing w:line="240" w:lineRule="auto"/>
               <w:ind w:firstLine="0"/>
               <w:rPr>
-                <w:sz w:val="22"/>
-              </w:rPr>
-            </w:pPr>
-            <w:r>
-              <w:rPr>
-                <w:sz w:val="22"/>
+                <w:sz w:val="24"/>
+                <w:szCs w:val="24"/>
+              </w:rPr>
+            </w:pPr>
+            <w:r>
+              <w:rPr>
+                <w:sz w:val="24"/>
+                <w:szCs w:val="24"/>
               </w:rPr>
               <w:t>OpenCloseTransaction</w:t>
             </w:r>
@@ -3119,12 +3232,14 @@
               <w:spacing w:line="240" w:lineRule="auto"/>
               <w:ind w:firstLine="0"/>
               <w:rPr>
-                <w:sz w:val="22"/>
-              </w:rPr>
-            </w:pPr>
-            <w:r>
-              <w:rPr>
-                <w:sz w:val="22"/>
+                <w:sz w:val="24"/>
+                <w:szCs w:val="24"/>
+              </w:rPr>
+            </w:pPr>
+            <w:r>
+              <w:rPr>
+                <w:sz w:val="24"/>
+                <w:szCs w:val="24"/>
               </w:rPr>
               <w:t>Запускает транзакцию типа open/close (используется в отдельных сценариях работы с БД)</w:t>
             </w:r>
@@ -3169,7 +3284,7 @@
       <w:tblGrid>
         <w:gridCol w:w="1555"/>
         <w:gridCol w:w="1275"/>
-        <w:gridCol w:w="1418"/>
+        <w:gridCol w:w="1529"/>
         <w:gridCol w:w="5103"/>
       </w:tblGrid>
       <w:tr>
@@ -3189,12 +3304,14 @@
               <w:ind w:firstLine="0"/>
               <w:jc w:val="center"/>
               <w:rPr>
-                <w:sz w:val="22"/>
-              </w:rPr>
-            </w:pPr>
-            <w:r>
-              <w:rPr>
-                <w:sz w:val="22"/>
+                <w:sz w:val="24"/>
+                <w:szCs w:val="24"/>
+              </w:rPr>
+            </w:pPr>
+            <w:r>
+              <w:rPr>
+                <w:sz w:val="24"/>
+                <w:szCs w:val="24"/>
               </w:rPr>
               <w:t>Название</w:t>
             </w:r>
@@ -3213,12 +3330,14 @@
               <w:ind w:firstLine="0"/>
               <w:jc w:val="center"/>
               <w:rPr>
-                <w:sz w:val="22"/>
-              </w:rPr>
-            </w:pPr>
-            <w:r>
-              <w:rPr>
-                <w:sz w:val="22"/>
+                <w:sz w:val="24"/>
+                <w:szCs w:val="24"/>
+              </w:rPr>
+            </w:pPr>
+            <w:r>
+              <w:rPr>
+                <w:sz w:val="24"/>
+                <w:szCs w:val="24"/>
               </w:rPr>
               <w:t>Входные параметры</w:t>
             </w:r>
@@ -3237,12 +3356,14 @@
               <w:ind w:firstLine="0"/>
               <w:jc w:val="center"/>
               <w:rPr>
-                <w:sz w:val="22"/>
-              </w:rPr>
-            </w:pPr>
-            <w:r>
-              <w:rPr>
-                <w:sz w:val="22"/>
+                <w:sz w:val="24"/>
+                <w:szCs w:val="24"/>
+              </w:rPr>
+            </w:pPr>
+            <w:r>
+              <w:rPr>
+                <w:sz w:val="24"/>
+                <w:szCs w:val="24"/>
               </w:rPr>
               <w:t>Тип возвращаемых данных</w:t>
             </w:r>
@@ -3261,12 +3382,14 @@
               <w:ind w:firstLine="0"/>
               <w:jc w:val="center"/>
               <w:rPr>
-                <w:sz w:val="22"/>
-              </w:rPr>
-            </w:pPr>
-            <w:r>
-              <w:rPr>
-                <w:sz w:val="22"/>
+                <w:sz w:val="24"/>
+                <w:szCs w:val="24"/>
+              </w:rPr>
+            </w:pPr>
+            <w:r>
+              <w:rPr>
+                <w:sz w:val="24"/>
+                <w:szCs w:val="24"/>
               </w:rPr>
               <w:t>Описание</w:t>
             </w:r>
@@ -3285,12 +3408,14 @@
               <w:spacing w:line="240" w:lineRule="auto"/>
               <w:ind w:firstLine="0"/>
               <w:rPr>
-                <w:sz w:val="22"/>
-              </w:rPr>
-            </w:pPr>
-            <w:r>
-              <w:rPr>
-                <w:sz w:val="22"/>
+                <w:sz w:val="24"/>
+                <w:szCs w:val="24"/>
+              </w:rPr>
+            </w:pPr>
+            <w:r>
+              <w:rPr>
+                <w:sz w:val="24"/>
+                <w:szCs w:val="24"/>
               </w:rPr>
               <w:t>AppendEntity</w:t>
             </w:r>
@@ -3307,12 +3432,14 @@
               <w:spacing w:line="240" w:lineRule="auto"/>
               <w:ind w:firstLine="0"/>
               <w:rPr>
-                <w:sz w:val="22"/>
-              </w:rPr>
-            </w:pPr>
-            <w:r>
-              <w:rPr>
-                <w:sz w:val="22"/>
+                <w:sz w:val="24"/>
+                <w:szCs w:val="24"/>
+              </w:rPr>
+            </w:pPr>
+            <w:r>
+              <w:rPr>
+                <w:sz w:val="24"/>
+                <w:szCs w:val="24"/>
               </w:rPr>
               <w:t>Entity entity</w:t>
             </w:r>
@@ -3329,12 +3456,14 @@
               <w:spacing w:line="240" w:lineRule="auto"/>
               <w:ind w:firstLine="0"/>
               <w:rPr>
-                <w:sz w:val="22"/>
-              </w:rPr>
-            </w:pPr>
-            <w:r>
-              <w:rPr>
-                <w:sz w:val="22"/>
+                <w:sz w:val="24"/>
+                <w:szCs w:val="24"/>
+              </w:rPr>
+            </w:pPr>
+            <w:r>
+              <w:rPr>
+                <w:sz w:val="24"/>
+                <w:szCs w:val="24"/>
               </w:rPr>
               <w:t>ObjectId</w:t>
             </w:r>
@@ -3351,12 +3480,14 @@
               <w:spacing w:line="240" w:lineRule="auto"/>
               <w:ind w:firstLine="0"/>
               <w:rPr>
-                <w:sz w:val="22"/>
-              </w:rPr>
-            </w:pPr>
-            <w:r>
-              <w:rPr>
-                <w:sz w:val="22"/>
+                <w:sz w:val="24"/>
+                <w:szCs w:val="24"/>
+              </w:rPr>
+            </w:pPr>
+            <w:r>
+              <w:rPr>
+                <w:sz w:val="24"/>
+                <w:szCs w:val="24"/>
               </w:rPr>
               <w:t>Добавляет примитив (сущность) в блок/пространство чертежа и возвращает его идентификатор</w:t>
             </w:r>
@@ -3377,8 +3508,73 @@
       </w:r>
     </w:p>
     <w:p/>
+    <w:p>
+      <w:r>
+        <w:t xml:space="preserve">В качестве аналога можно рассмотреть аддон Fasteners Workbench для FreeCAD </w:t>
+      </w:r>
+      <w:r>
+        <w:t>[1]</w:t>
+      </w:r>
+      <w:r>
+        <w:t>. Он предназначен для добавления в 3D</w:t>
+      </w:r>
+      <w:r>
+        <w:noBreakHyphen/>
+        <w:t xml:space="preserve">модель стандартных крепёжных изделий, включая шайбы, с возможностью параметрической настройки размеров через графический интерфейс. Пользователь выбирает </w:t>
+      </w:r>
+      <w:r>
+        <w:lastRenderedPageBreak/>
+        <w:t>тип изделия и типоразмер, после чего крепёж вставляется в модель и может быть изменён по параметрам.</w:t>
+      </w:r>
+    </w:p>
+    <w:p>
+      <w:r>
+        <w:t>Сходство с разрабатываемым плагином заключается в том, что оба решения автоматизируют получение 3D</w:t>
+      </w:r>
+      <w:r>
+        <w:noBreakHyphen/>
+        <w:t>геометрии шайбы по заданным параметрам. Отличие состоит в том, что Fasteners Workbench ориентирован на библиотеку стандартных изделий и их вставку, а разрабатываемый плагин для nanoCAD строит конкретную деталь “эксцентриковая шайба” алгоритмически и дополнительно выполняет проверку взаимозависимых параметров.</w:t>
+      </w:r>
+    </w:p>
+    <w:p>
+      <w:r>
+        <w:t xml:space="preserve">Рисунок 1.1 – </w:t>
+      </w:r>
+    </w:p>
     <w:p/>
-    <w:p/>
+    <w:p>
+      <w:r>
+        <w:t>В качестве ещё одного аналога можно привести библиотеку стандартных механических компонентов BricsCAD Mechanical</w:t>
+      </w:r>
+      <w:r>
+        <w:t xml:space="preserve"> [2]</w:t>
+      </w:r>
+      <w:r>
+        <w:t>. Данный инструмент предоставляет пользователю каталог типовых деталей (в том числе шайб) и позволяет добавлять их в проект с последующей параметрической настройкой размеров через интерфейс панели библиотеки/свойств.</w:t>
+      </w:r>
+    </w:p>
+    <w:p>
+      <w:r>
+        <w:t>Сходство с разрабатываемым плагином заключается в наличии параметрического подхода к получению модели шайбы. Отличие состоит в том, что BricsCAD Mechanical предоставляет готовые стандартные компоненты из библиотеки, тогда как разрабатываемый плагин для nanoCAD строит эксцентриковую шайбу по пяти параметрам и реализует проверки корректности, в том числе взаимосвязь параметров, определяющих допустимое смещение отверстия.</w:t>
+      </w:r>
+    </w:p>
+    <w:p>
+      <w:pPr>
+        <w:rPr>
+          <w:lang w:val="en-US"/>
+        </w:rPr>
+      </w:pPr>
+      <w:r>
+        <w:t xml:space="preserve">Рисунок 1.2 – </w:t>
+      </w:r>
+    </w:p>
+    <w:p>
+      <w:pPr>
+        <w:rPr>
+          <w:lang w:val="en-US"/>
+        </w:rPr>
+      </w:pPr>
+    </w:p>
     <w:p>
       <w:r>
         <w:br w:type="page"/>
@@ -3464,8 +3660,32 @@
       <w:bookmarkEnd w:id="1"/>
     </w:p>
     <w:p/>
-    <w:p/>
-    <w:p/>
+    <w:p>
+      <w:pPr>
+        <w:rPr>
+          <w:lang w:val="en-US"/>
+        </w:rPr>
+      </w:pPr>
+      <w:r>
+        <w:rPr>
+          <w:lang w:val="en-US"/>
+        </w:rPr>
+        <w:t xml:space="preserve">1. </w:t>
+      </w:r>
+    </w:p>
+    <w:p>
+      <w:pPr>
+        <w:rPr>
+          <w:lang w:val="en-US"/>
+        </w:rPr>
+      </w:pPr>
+      <w:r>
+        <w:rPr>
+          <w:lang w:val="en-US"/>
+        </w:rPr>
+        <w:t xml:space="preserve">2. </w:t>
+      </w:r>
+    </w:p>
     <w:sectPr>
       <w:footerReference w:type="default" r:id="rId8"/>
       <w:footerReference w:type="first" r:id="rId9"/>

</xml_diff>